<commit_message>
docs: add English version to project prompts guide
</commit_message>
<xml_diff>
--- a/docs/articles/publication/NASA_HOME_CLOUD_PROJECT_PROMPTS_RU_EN.docx
+++ b/docs/articles/publication/NASA_HOME_CLOUD_PROJECT_PROMPTS_RU_EN.docx
@@ -5511,6 +5511,3877 @@
             </w:pPr>
             <w:r>
               <w:t>Проведи отдельную read-only диагностику failed smartd.service на Jetson. Не меняй USB, storage, fstab, Docker, firewall, VPN или данные. Собери systemctl status, journalctl только для unit, установленную конфигурацию smartd, поддержку SMART мостом JMS583 и расхождения между repo/runtime. Определи корневую причину, предложи минимальное исправление, команды проверки и rollback. До отдельного подтверждения исправление не применяй.</w:t>
+            </w:r>
+          </w:p>
+        </w:tc>
+      </w:tr>
+    </w:tbl>
+    <w:p/>
+    <w:p>
+      <w:r>
+        <w:br w:type="page"/>
+      </w:r>
+    </w:p>
+    <w:p>
+      <w:pPr>
+        <w:jc w:val="center"/>
+      </w:pPr>
+      <w:r>
+        <w:rPr>
+          <w:b/>
+          <w:color w:val="1F4E79"/>
+          <w:sz w:val="44"/>
+        </w:rPr>
+        <w:t>ENGLISH VERSION — NASA HOME CLOUD PROJECT PROMPTS</w:t>
+      </w:r>
+    </w:p>
+    <w:p>
+      <w:pPr>
+        <w:jc w:val="center"/>
+      </w:pPr>
+      <w:r>
+        <w:rPr>
+          <w:i/>
+          <w:sz w:val="26"/>
+        </w:rPr>
+        <w:t>Installation prompt, plan clarifications, execution results, and engineering rationale</w:t>
+      </w:r>
+    </w:p>
+    <w:p>
+      <w:pPr>
+        <w:pStyle w:val="Heading1"/>
+      </w:pPr>
+      <w:r>
+        <w:t>How to use this English section</w:t>
+      </w:r>
+    </w:p>
+    <w:p>
+      <w:r>
+        <w:t>Send the installation prompt once at the beginning of a session or after complete context loss. Then select a stage from the plan and send only its short clarification. The mandatory rules are intentionally not repeated inside every stage.</w:t>
+      </w:r>
+    </w:p>
+    <w:p>
+      <w:pPr>
+        <w:pStyle w:val="ListBullet"/>
+      </w:pPr>
+      <w:r>
+        <w:t>The Russian and English sections describe the same 22-stage engineering process.</w:t>
+      </w:r>
+    </w:p>
+    <w:p>
+      <w:pPr>
+        <w:pStyle w:val="ListBullet"/>
+      </w:pPr>
+      <w:r>
+        <w:t>Environment-specific addresses, URLs, author metadata, credentials, and personal information are omitted.</w:t>
+      </w:r>
+    </w:p>
+    <w:p>
+      <w:pPr>
+        <w:pStyle w:val="ListBullet"/>
+      </w:pPr>
+      <w:r>
+        <w:t>Completed work, historical measurements, and planned work are labeled separately.</w:t>
+      </w:r>
+    </w:p>
+    <w:p>
+      <w:pPr>
+        <w:pStyle w:val="ListBullet"/>
+      </w:pPr>
+      <w:r>
+        <w:t>A change is complete only after verification, documented rollback, and an explicit risk statement.</w:t>
+      </w:r>
+    </w:p>
+    <w:p>
+      <w:pPr>
+        <w:pStyle w:val="Heading1"/>
+      </w:pPr>
+      <w:r>
+        <w:t>Installation prompt — send once</w:t>
+      </w:r>
+    </w:p>
+    <w:tbl>
+      <w:tblPr>
+        <w:tblW w:type="auto" w:w="0"/>
+        <w:jc w:val="center"/>
+        <w:tblLook w:firstColumn="1" w:firstRow="1" w:lastColumn="0" w:lastRow="0" w:noHBand="0" w:noVBand="1" w:val="04A0"/>
+      </w:tblPr>
+      <w:tblGrid>
+        <w:gridCol w:w="10080"/>
+      </w:tblGrid>
+      <w:tr>
+        <w:tc>
+          <w:tcPr>
+            <w:tcW w:type="dxa" w:w="10080"/>
+            <w:shd w:fill="F2F6FA"/>
+          </w:tcPr>
+          <w:p>
+            <w:r>
+              <w:rPr>
+                <w:rFonts w:ascii="Aptos" w:hAnsi="Aptos"/>
+                <w:sz w:val="18"/>
+              </w:rPr>
+              <w:t>You are acting as a software engineer, DevOps engineer, and system administrator for the NASA Home Cloud project.</w:t>
+              <w:br/>
+              <w:br/>
+              <w:t>Mandatory rules:</w:t>
+              <w:br/>
+              <w:t>1. Work in small steps: one technical block followed by one result check.</w:t>
+              <w:br/>
+              <w:t>2. Never place real passwords, tokens, keys, personal resource addresses, or personal data in the repository or reports.</w:t>
+              <w:br/>
+              <w:t>3. Do not format disks, change partition tables, delete databases, or remove Docker volumes without separate explicit approval.</w:t>
+              <w:br/>
+              <w:t>4. Do not expose Nextcloud, Immich, LLM Gateway, Samba, or SSH directly to the Internet.</w:t>
+              <w:br/>
+              <w:t>5. Do not modify the production family VPN server through SSH, low-level VPN commands, or manual configuration edits.</w:t>
+              <w:br/>
+              <w:t>6. Do not remove the Jetson network profile; use placeholders for all environment-specific network values.</w:t>
+              <w:br/>
+              <w:t>7. Before a change, state what changes, why, affected files, commands, verification, and rollback.</w:t>
+              <w:br/>
+              <w:t>8. Verify facts with read-only checks before making assumptions.</w:t>
+              <w:br/>
+              <w:t>9. Finish with changed files, evidence, risks, and the next safe step.</w:t>
+            </w:r>
+          </w:p>
+        </w:tc>
+      </w:tr>
+    </w:tbl>
+    <w:p/>
+    <w:p>
+      <w:pPr>
+        <w:pStyle w:val="Heading1"/>
+      </w:pPr>
+      <w:r>
+        <w:t>Stage index</w:t>
+      </w:r>
+    </w:p>
+    <w:tbl>
+      <w:tblPr>
+        <w:tblStyle w:val="TableGrid"/>
+        <w:tblW w:type="auto" w:w="0"/>
+        <w:jc w:val="center"/>
+        <w:tblLook w:firstColumn="1" w:firstRow="1" w:lastColumn="0" w:lastRow="0" w:noHBand="0" w:noVBand="1" w:val="04A0"/>
+      </w:tblPr>
+      <w:tblGrid>
+        <w:gridCol w:w="3360"/>
+        <w:gridCol w:w="3360"/>
+        <w:gridCol w:w="3360"/>
+      </w:tblGrid>
+      <w:tr>
+        <w:tc>
+          <w:tcPr>
+            <w:tcW w:type="dxa" w:w="3360"/>
+            <w:shd w:fill="1F4E79"/>
+          </w:tcPr>
+          <w:p>
+            <w:r>
+              <w:rPr>
+                <w:b/>
+                <w:color w:val="FFFFFF"/>
+              </w:rPr>
+              <w:t>No.</w:t>
+            </w:r>
+          </w:p>
+        </w:tc>
+        <w:tc>
+          <w:tcPr>
+            <w:tcW w:type="dxa" w:w="3360"/>
+            <w:shd w:fill="1F4E79"/>
+          </w:tcPr>
+          <w:p>
+            <w:r>
+              <w:rPr>
+                <w:b/>
+                <w:color w:val="FFFFFF"/>
+              </w:rPr>
+              <w:t>Stage</w:t>
+            </w:r>
+          </w:p>
+        </w:tc>
+        <w:tc>
+          <w:tcPr>
+            <w:tcW w:type="dxa" w:w="3360"/>
+            <w:shd w:fill="1F4E79"/>
+          </w:tcPr>
+          <w:p>
+            <w:r>
+              <w:rPr>
+                <w:b/>
+                <w:color w:val="FFFFFF"/>
+              </w:rPr>
+              <w:t>State</w:t>
+            </w:r>
+          </w:p>
+        </w:tc>
+      </w:tr>
+      <w:tr>
+        <w:tc>
+          <w:tcPr>
+            <w:tcW w:type="dxa" w:w="3360"/>
+          </w:tcPr>
+          <w:p>
+            <w:r>
+              <w:t>1</w:t>
+            </w:r>
+          </w:p>
+        </w:tc>
+        <w:tc>
+          <w:tcPr>
+            <w:tcW w:type="dxa" w:w="3360"/>
+          </w:tcPr>
+          <w:p>
+            <w:r>
+              <w:t>Define the product and project boundaries</w:t>
+            </w:r>
+          </w:p>
+        </w:tc>
+        <w:tc>
+          <w:tcPr>
+            <w:tcW w:type="dxa" w:w="3360"/>
+          </w:tcPr>
+          <w:p>
+            <w:r>
+              <w:t>Implemented / verified</w:t>
+            </w:r>
+          </w:p>
+        </w:tc>
+      </w:tr>
+      <w:tr>
+        <w:tc>
+          <w:tcPr>
+            <w:tcW w:type="dxa" w:w="3360"/>
+          </w:tcPr>
+          <w:p>
+            <w:r>
+              <w:t>2</w:t>
+            </w:r>
+          </w:p>
+        </w:tc>
+        <w:tc>
+          <w:tcPr>
+            <w:tcW w:type="dxa" w:w="3360"/>
+          </w:tcPr>
+          <w:p>
+            <w:r>
+              <w:t>Bootstrap the repository and safety rules</w:t>
+            </w:r>
+          </w:p>
+        </w:tc>
+        <w:tc>
+          <w:tcPr>
+            <w:tcW w:type="dxa" w:w="3360"/>
+          </w:tcPr>
+          <w:p>
+            <w:r>
+              <w:t>Implemented / verified</w:t>
+            </w:r>
+          </w:p>
+        </w:tc>
+      </w:tr>
+      <w:tr>
+        <w:tc>
+          <w:tcPr>
+            <w:tcW w:type="dxa" w:w="3360"/>
+          </w:tcPr>
+          <w:p>
+            <w:r>
+              <w:t>3</w:t>
+            </w:r>
+          </w:p>
+        </w:tc>
+        <w:tc>
+          <w:tcPr>
+            <w:tcW w:type="dxa" w:w="3360"/>
+          </w:tcPr>
+          <w:p>
+            <w:r>
+              <w:t>Perform a read-only hardware audit</w:t>
+            </w:r>
+          </w:p>
+        </w:tc>
+        <w:tc>
+          <w:tcPr>
+            <w:tcW w:type="dxa" w:w="3360"/>
+          </w:tcPr>
+          <w:p>
+            <w:r>
+              <w:t>Implemented / verified</w:t>
+            </w:r>
+          </w:p>
+        </w:tc>
+      </w:tr>
+      <w:tr>
+        <w:tc>
+          <w:tcPr>
+            <w:tcW w:type="dxa" w:w="3360"/>
+          </w:tcPr>
+          <w:p>
+            <w:r>
+              <w:t>4</w:t>
+            </w:r>
+          </w:p>
+        </w:tc>
+        <w:tc>
+          <w:tcPr>
+            <w:tcW w:type="dxa" w:w="3360"/>
+          </w:tcPr>
+          <w:p>
+            <w:r>
+              <w:t>Design and prepare storage</w:t>
+            </w:r>
+          </w:p>
+        </w:tc>
+        <w:tc>
+          <w:tcPr>
+            <w:tcW w:type="dxa" w:w="3360"/>
+          </w:tcPr>
+          <w:p>
+            <w:r>
+              <w:t>Implemented / verified</w:t>
+            </w:r>
+          </w:p>
+        </w:tc>
+      </w:tr>
+      <w:tr>
+        <w:tc>
+          <w:tcPr>
+            <w:tcW w:type="dxa" w:w="3360"/>
+          </w:tcPr>
+          <w:p>
+            <w:r>
+              <w:t>5</w:t>
+            </w:r>
+          </w:p>
+        </w:tc>
+        <w:tc>
+          <w:tcPr>
+            <w:tcW w:type="dxa" w:w="3360"/>
+          </w:tcPr>
+          <w:p>
+            <w:r>
+              <w:t>Build the modular Docker architecture</w:t>
+            </w:r>
+          </w:p>
+        </w:tc>
+        <w:tc>
+          <w:tcPr>
+            <w:tcW w:type="dxa" w:w="3360"/>
+          </w:tcPr>
+          <w:p>
+            <w:r>
+              <w:t>Implemented / verified</w:t>
+            </w:r>
+          </w:p>
+        </w:tc>
+      </w:tr>
+      <w:tr>
+        <w:tc>
+          <w:tcPr>
+            <w:tcW w:type="dxa" w:w="3360"/>
+          </w:tcPr>
+          <w:p>
+            <w:r>
+              <w:t>6</w:t>
+            </w:r>
+          </w:p>
+        </w:tc>
+        <w:tc>
+          <w:tcPr>
+            <w:tcW w:type="dxa" w:w="3360"/>
+          </w:tcPr>
+          <w:p>
+            <w:r>
+              <w:t>Deploy Nextcloud</w:t>
+            </w:r>
+          </w:p>
+        </w:tc>
+        <w:tc>
+          <w:tcPr>
+            <w:tcW w:type="dxa" w:w="3360"/>
+          </w:tcPr>
+          <w:p>
+            <w:r>
+              <w:t>Implemented / verified</w:t>
+            </w:r>
+          </w:p>
+        </w:tc>
+      </w:tr>
+      <w:tr>
+        <w:tc>
+          <w:tcPr>
+            <w:tcW w:type="dxa" w:w="3360"/>
+          </w:tcPr>
+          <w:p>
+            <w:r>
+              <w:t>7</w:t>
+            </w:r>
+          </w:p>
+        </w:tc>
+        <w:tc>
+          <w:tcPr>
+            <w:tcW w:type="dxa" w:w="3360"/>
+          </w:tcPr>
+          <w:p>
+            <w:r>
+              <w:t>Deploy Immich in a resource-conscious mode</w:t>
+            </w:r>
+          </w:p>
+        </w:tc>
+        <w:tc>
+          <w:tcPr>
+            <w:tcW w:type="dxa" w:w="3360"/>
+          </w:tcPr>
+          <w:p>
+            <w:r>
+              <w:t>Implemented / verified</w:t>
+            </w:r>
+          </w:p>
+        </w:tc>
+      </w:tr>
+      <w:tr>
+        <w:tc>
+          <w:tcPr>
+            <w:tcW w:type="dxa" w:w="3360"/>
+          </w:tcPr>
+          <w:p>
+            <w:r>
+              <w:t>8</w:t>
+            </w:r>
+          </w:p>
+        </w:tc>
+        <w:tc>
+          <w:tcPr>
+            <w:tcW w:type="dxa" w:w="3360"/>
+          </w:tcPr>
+          <w:p>
+            <w:r>
+              <w:t>Provide LAN-only Samba access</w:t>
+            </w:r>
+          </w:p>
+        </w:tc>
+        <w:tc>
+          <w:tcPr>
+            <w:tcW w:type="dxa" w:w="3360"/>
+          </w:tcPr>
+          <w:p>
+            <w:r>
+              <w:t>Implemented / verified</w:t>
+            </w:r>
+          </w:p>
+        </w:tc>
+      </w:tr>
+      <w:tr>
+        <w:tc>
+          <w:tcPr>
+            <w:tcW w:type="dxa" w:w="3360"/>
+          </w:tcPr>
+          <w:p>
+            <w:r>
+              <w:t>9</w:t>
+            </w:r>
+          </w:p>
+        </w:tc>
+        <w:tc>
+          <w:tcPr>
+            <w:tcW w:type="dxa" w:w="3360"/>
+          </w:tcPr>
+          <w:p>
+            <w:r>
+              <w:t>Create a privacy-aware LLM Gateway</w:t>
+            </w:r>
+          </w:p>
+        </w:tc>
+        <w:tc>
+          <w:tcPr>
+            <w:tcW w:type="dxa" w:w="3360"/>
+          </w:tcPr>
+          <w:p>
+            <w:r>
+              <w:t>Implemented / verified</w:t>
+            </w:r>
+          </w:p>
+        </w:tc>
+      </w:tr>
+      <w:tr>
+        <w:tc>
+          <w:tcPr>
+            <w:tcW w:type="dxa" w:w="3360"/>
+          </w:tcPr>
+          <w:p>
+            <w:r>
+              <w:t>10</w:t>
+            </w:r>
+          </w:p>
+        </w:tc>
+        <w:tc>
+          <w:tcPr>
+            <w:tcW w:type="dxa" w:w="3360"/>
+          </w:tcPr>
+          <w:p>
+            <w:r>
+              <w:t>Stabilize local networking</w:t>
+            </w:r>
+          </w:p>
+        </w:tc>
+        <w:tc>
+          <w:tcPr>
+            <w:tcW w:type="dxa" w:w="3360"/>
+          </w:tcPr>
+          <w:p>
+            <w:r>
+              <w:t>Implemented / verified</w:t>
+            </w:r>
+          </w:p>
+        </w:tc>
+      </w:tr>
+      <w:tr>
+        <w:tc>
+          <w:tcPr>
+            <w:tcW w:type="dxa" w:w="3360"/>
+          </w:tcPr>
+          <w:p>
+            <w:r>
+              <w:t>11</w:t>
+            </w:r>
+          </w:p>
+        </w:tc>
+        <w:tc>
+          <w:tcPr>
+            <w:tcW w:type="dxa" w:w="3360"/>
+          </w:tcPr>
+          <w:p>
+            <w:r>
+              <w:t>Implement external access through a VPS reverse tunnel</w:t>
+            </w:r>
+          </w:p>
+        </w:tc>
+        <w:tc>
+          <w:tcPr>
+            <w:tcW w:type="dxa" w:w="3360"/>
+          </w:tcPr>
+          <w:p>
+            <w:r>
+              <w:t>Implemented / verified</w:t>
+            </w:r>
+          </w:p>
+        </w:tc>
+      </w:tr>
+      <w:tr>
+        <w:tc>
+          <w:tcPr>
+            <w:tcW w:type="dxa" w:w="3360"/>
+          </w:tcPr>
+          <w:p>
+            <w:r>
+              <w:t>12</w:t>
+            </w:r>
+          </w:p>
+        </w:tc>
+        <w:tc>
+          <w:tcPr>
+            <w:tcW w:type="dxa" w:w="3360"/>
+          </w:tcPr>
+          <w:p>
+            <w:r>
+              <w:t>Add HTTPS for mobile clients</w:t>
+            </w:r>
+          </w:p>
+        </w:tc>
+        <w:tc>
+          <w:tcPr>
+            <w:tcW w:type="dxa" w:w="3360"/>
+          </w:tcPr>
+          <w:p>
+            <w:r>
+              <w:t>Implemented / verified</w:t>
+            </w:r>
+          </w:p>
+        </w:tc>
+      </w:tr>
+      <w:tr>
+        <w:tc>
+          <w:tcPr>
+            <w:tcW w:type="dxa" w:w="3360"/>
+          </w:tcPr>
+          <w:p>
+            <w:r>
+              <w:t>13</w:t>
+            </w:r>
+          </w:p>
+        </w:tc>
+        <w:tc>
+          <w:tcPr>
+            <w:tcW w:type="dxa" w:w="3360"/>
+          </w:tcPr>
+          <w:p>
+            <w:r>
+              <w:t>Deploy lightweight monitoring</w:t>
+            </w:r>
+          </w:p>
+        </w:tc>
+        <w:tc>
+          <w:tcPr>
+            <w:tcW w:type="dxa" w:w="3360"/>
+          </w:tcPr>
+          <w:p>
+            <w:r>
+              <w:t>Implemented / verified</w:t>
+            </w:r>
+          </w:p>
+        </w:tc>
+      </w:tr>
+      <w:tr>
+        <w:tc>
+          <w:tcPr>
+            <w:tcW w:type="dxa" w:w="3360"/>
+          </w:tcPr>
+          <w:p>
+            <w:r>
+              <w:t>14</w:t>
+            </w:r>
+          </w:p>
+        </w:tc>
+        <w:tc>
+          <w:tcPr>
+            <w:tcW w:type="dxa" w:w="3360"/>
+          </w:tcPr>
+          <w:p>
+            <w:r>
+              <w:t>Generate daily reports and notifications</w:t>
+            </w:r>
+          </w:p>
+        </w:tc>
+        <w:tc>
+          <w:tcPr>
+            <w:tcW w:type="dxa" w:w="3360"/>
+          </w:tcPr>
+          <w:p>
+            <w:r>
+              <w:t>Implemented / verified</w:t>
+            </w:r>
+          </w:p>
+        </w:tc>
+      </w:tr>
+      <w:tr>
+        <w:tc>
+          <w:tcPr>
+            <w:tcW w:type="dxa" w:w="3360"/>
+          </w:tcPr>
+          <w:p>
+            <w:r>
+              <w:t>15</w:t>
+            </w:r>
+          </w:p>
+        </w:tc>
+        <w:tc>
+          <w:tcPr>
+            <w:tcW w:type="dxa" w:w="3360"/>
+          </w:tcPr>
+          <w:p>
+            <w:r>
+              <w:t>Build the NASA automation API</w:t>
+            </w:r>
+          </w:p>
+        </w:tc>
+        <w:tc>
+          <w:tcPr>
+            <w:tcW w:type="dxa" w:w="3360"/>
+          </w:tcPr>
+          <w:p>
+            <w:r>
+              <w:t>Implemented / verified</w:t>
+            </w:r>
+          </w:p>
+        </w:tc>
+      </w:tr>
+      <w:tr>
+        <w:tc>
+          <w:tcPr>
+            <w:tcW w:type="dxa" w:w="3360"/>
+          </w:tcPr>
+          <w:p>
+            <w:r>
+              <w:t>16</w:t>
+            </w:r>
+          </w:p>
+        </w:tc>
+        <w:tc>
+          <w:tcPr>
+            <w:tcW w:type="dxa" w:w="3360"/>
+          </w:tcPr>
+          <w:p>
+            <w:r>
+              <w:t>Automate infrastructure validation</w:t>
+            </w:r>
+          </w:p>
+        </w:tc>
+        <w:tc>
+          <w:tcPr>
+            <w:tcW w:type="dxa" w:w="3360"/>
+          </w:tcPr>
+          <w:p>
+            <w:r>
+              <w:t>Implemented / verified</w:t>
+            </w:r>
+          </w:p>
+        </w:tc>
+      </w:tr>
+      <w:tr>
+        <w:tc>
+          <w:tcPr>
+            <w:tcW w:type="dxa" w:w="3360"/>
+          </w:tcPr>
+          <w:p>
+            <w:r>
+              <w:t>17</w:t>
+            </w:r>
+          </w:p>
+        </w:tc>
+        <w:tc>
+          <w:tcPr>
+            <w:tcW w:type="dxa" w:w="3360"/>
+          </w:tcPr>
+          <w:p>
+            <w:r>
+              <w:t>Implement backup and restore preparation</w:t>
+            </w:r>
+          </w:p>
+        </w:tc>
+        <w:tc>
+          <w:tcPr>
+            <w:tcW w:type="dxa" w:w="3360"/>
+          </w:tcPr>
+          <w:p>
+            <w:r>
+              <w:t>Implemented / verified</w:t>
+            </w:r>
+          </w:p>
+        </w:tc>
+      </w:tr>
+      <w:tr>
+        <w:tc>
+          <w:tcPr>
+            <w:tcW w:type="dxa" w:w="3360"/>
+          </w:tcPr>
+          <w:p>
+            <w:r>
+              <w:t>18</w:t>
+            </w:r>
+          </w:p>
+        </w:tc>
+        <w:tc>
+          <w:tcPr>
+            <w:tcW w:type="dxa" w:w="3360"/>
+          </w:tcPr>
+          <w:p>
+            <w:r>
+              <w:t>Investigate USB storage incidents</w:t>
+            </w:r>
+          </w:p>
+        </w:tc>
+        <w:tc>
+          <w:tcPr>
+            <w:tcW w:type="dxa" w:w="3360"/>
+          </w:tcPr>
+          <w:p>
+            <w:r>
+              <w:t>Implemented / verified</w:t>
+            </w:r>
+          </w:p>
+        </w:tc>
+      </w:tr>
+      <w:tr>
+        <w:tc>
+          <w:tcPr>
+            <w:tcW w:type="dxa" w:w="3360"/>
+          </w:tcPr>
+          <w:p>
+            <w:r>
+              <w:t>19</w:t>
+            </w:r>
+          </w:p>
+        </w:tc>
+        <w:tc>
+          <w:tcPr>
+            <w:tcW w:type="dxa" w:w="3360"/>
+          </w:tcPr>
+          <w:p>
+            <w:r>
+              <w:t>Audit security and privacy</w:t>
+            </w:r>
+          </w:p>
+        </w:tc>
+        <w:tc>
+          <w:tcPr>
+            <w:tcW w:type="dxa" w:w="3360"/>
+          </w:tcPr>
+          <w:p>
+            <w:r>
+              <w:t>Implemented / verified</w:t>
+            </w:r>
+          </w:p>
+        </w:tc>
+      </w:tr>
+      <w:tr>
+        <w:tc>
+          <w:tcPr>
+            <w:tcW w:type="dxa" w:w="3360"/>
+          </w:tcPr>
+          <w:p>
+            <w:r>
+              <w:t>20</w:t>
+            </w:r>
+          </w:p>
+        </w:tc>
+        <w:tc>
+          <w:tcPr>
+            <w:tcW w:type="dxa" w:w="3360"/>
+          </w:tcPr>
+          <w:p>
+            <w:r>
+              <w:t>Prepare the article and its evidence</w:t>
+            </w:r>
+          </w:p>
+        </w:tc>
+        <w:tc>
+          <w:tcPr>
+            <w:tcW w:type="dxa" w:w="3360"/>
+          </w:tcPr>
+          <w:p>
+            <w:r>
+              <w:t>Implemented / verified</w:t>
+            </w:r>
+          </w:p>
+        </w:tc>
+      </w:tr>
+      <w:tr>
+        <w:tc>
+          <w:tcPr>
+            <w:tcW w:type="dxa" w:w="3360"/>
+          </w:tcPr>
+          <w:p>
+            <w:r>
+              <w:t>21</w:t>
+            </w:r>
+          </w:p>
+        </w:tc>
+        <w:tc>
+          <w:tcPr>
+            <w:tcW w:type="dxa" w:w="3360"/>
+          </w:tcPr>
+          <w:p>
+            <w:r>
+              <w:t>Run a live reliability audit</w:t>
+            </w:r>
+          </w:p>
+        </w:tc>
+        <w:tc>
+          <w:tcPr>
+            <w:tcW w:type="dxa" w:w="3360"/>
+          </w:tcPr>
+          <w:p>
+            <w:r>
+              <w:t>Implemented / verified</w:t>
+            </w:r>
+          </w:p>
+        </w:tc>
+      </w:tr>
+      <w:tr>
+        <w:tc>
+          <w:tcPr>
+            <w:tcW w:type="dxa" w:w="3360"/>
+          </w:tcPr>
+          <w:p>
+            <w:r>
+              <w:t>22</w:t>
+            </w:r>
+          </w:p>
+        </w:tc>
+        <w:tc>
+          <w:tcPr>
+            <w:tcW w:type="dxa" w:w="3360"/>
+          </w:tcPr>
+          <w:p>
+            <w:r>
+              <w:t>Plan an open-router migration</w:t>
+            </w:r>
+          </w:p>
+        </w:tc>
+        <w:tc>
+          <w:tcPr>
+            <w:tcW w:type="dxa" w:w="3360"/>
+          </w:tcPr>
+          <w:p>
+            <w:r>
+              <w:t>Planned</w:t>
+            </w:r>
+          </w:p>
+        </w:tc>
+      </w:tr>
+    </w:tbl>
+    <w:p>
+      <w:r>
+        <w:br w:type="page"/>
+      </w:r>
+    </w:p>
+    <w:p>
+      <w:pPr>
+        <w:pStyle w:val="Heading1"/>
+      </w:pPr>
+      <w:r>
+        <w:t>1. Define the product and project boundaries</w:t>
+      </w:r>
+    </w:p>
+    <w:p>
+      <w:pPr>
+        <w:pStyle w:val="Heading2"/>
+      </w:pPr>
+      <w:r>
+        <w:t>Plan clarification — send separately</w:t>
+      </w:r>
+    </w:p>
+    <w:tbl>
+      <w:tblPr>
+        <w:tblW w:type="auto" w:w="0"/>
+        <w:jc w:val="center"/>
+        <w:tblLook w:firstColumn="1" w:firstRow="1" w:lastColumn="0" w:lastRow="0" w:noHBand="0" w:noVBand="1" w:val="04A0"/>
+      </w:tblPr>
+      <w:tblGrid>
+        <w:gridCol w:w="10080"/>
+      </w:tblGrid>
+      <w:tr>
+        <w:tc>
+          <w:tcPr>
+            <w:tcW w:type="dxa" w:w="10080"/>
+            <w:shd w:fill="F2F6FA"/>
+          </w:tcPr>
+          <w:p>
+            <w:r>
+              <w:rPr>
+                <w:rFonts w:ascii="Aptos" w:hAnsi="Aptos"/>
+                <w:sz w:val="18"/>
+              </w:rPr>
+              <w:t>Analyze the idea of a home cloud on a 4 GB Jetson Nano. Produce Stage 1 requirements, acceptance criteria, risks, prohibited features, and a staged implementation plan.</w:t>
+            </w:r>
+          </w:p>
+        </w:tc>
+      </w:tr>
+    </w:tbl>
+    <w:p/>
+    <w:p>
+      <w:pPr>
+        <w:pStyle w:val="Heading2"/>
+      </w:pPr>
+      <w:r>
+        <w:t>Why this stage was needed</w:t>
+      </w:r>
+    </w:p>
+    <w:p>
+      <w:r>
+        <w:t>The limited RAM, legacy ARM64 platform, and microSD system disk required a narrow, measurable scope before selecting applications.</w:t>
+      </w:r>
+    </w:p>
+    <w:p>
+      <w:pPr>
+        <w:pStyle w:val="Heading2"/>
+      </w:pPr>
+      <w:r>
+        <w:t>What was created</w:t>
+      </w:r>
+    </w:p>
+    <w:p>
+      <w:r>
+        <w:t>Product concept, requirements, Stage 0–3 roadmap, LAN-only policy, and the decision not to deploy a local LLM during Stage 1.</w:t>
+      </w:r>
+    </w:p>
+    <w:p>
+      <w:pPr>
+        <w:pStyle w:val="Heading2"/>
+      </w:pPr>
+      <w:r>
+        <w:t>Execution result</w:t>
+      </w:r>
+    </w:p>
+    <w:p>
+      <w:r>
+        <w:rPr>
+          <w:b/>
+        </w:rPr>
+        <w:t>The platform was defined around Nextcloud, Immich, Samba, a controlled LLM Gateway, monitoring, backup, and an outbound reverse tunnel.</w:t>
+      </w:r>
+    </w:p>
+    <w:p>
+      <w:pPr>
+        <w:pStyle w:val="Heading2"/>
+      </w:pPr>
+      <w:r>
+        <w:t>How to verify it</w:t>
+      </w:r>
+    </w:p>
+    <w:p>
+      <w:pPr>
+        <w:pStyle w:val="ListBullet"/>
+      </w:pPr>
+      <w:r>
+        <w:t>Review the overview, requirements, architecture stages, and explicit out-of-scope list.</w:t>
+      </w:r>
+    </w:p>
+    <w:p>
+      <w:pPr>
+        <w:pStyle w:val="Heading2"/>
+      </w:pPr>
+      <w:r>
+        <w:t>Engineering lesson</w:t>
+      </w:r>
+    </w:p>
+    <w:p>
+      <w:r>
+        <w:t>Constrain the system before choosing software, especially on resource-limited hardware.</w:t>
+      </w:r>
+    </w:p>
+    <w:p>
+      <w:pPr>
+        <w:pStyle w:val="Heading2"/>
+      </w:pPr>
+      <w:r>
+        <w:t>Completion criterion</w:t>
+      </w:r>
+    </w:p>
+    <w:p>
+      <w:r>
+        <w:t>The stage is complete only when the result is reproducible from the repository, verification passes without disclosing sensitive data, rollback is clear, and remaining risks are recorded.</w:t>
+      </w:r>
+    </w:p>
+    <w:p>
+      <w:r>
+        <w:br w:type="page"/>
+      </w:r>
+    </w:p>
+    <w:p>
+      <w:pPr>
+        <w:pStyle w:val="Heading1"/>
+      </w:pPr>
+      <w:r>
+        <w:t>2. Bootstrap the repository and safety rules</w:t>
+      </w:r>
+    </w:p>
+    <w:p>
+      <w:pPr>
+        <w:pStyle w:val="Heading2"/>
+      </w:pPr>
+      <w:r>
+        <w:t>Plan clarification — send separately</w:t>
+      </w:r>
+    </w:p>
+    <w:tbl>
+      <w:tblPr>
+        <w:tblW w:type="auto" w:w="0"/>
+        <w:jc w:val="center"/>
+        <w:tblLook w:firstColumn="1" w:firstRow="1" w:lastColumn="0" w:lastRow="0" w:noHBand="0" w:noVBand="1" w:val="04A0"/>
+      </w:tblPr>
+      <w:tblGrid>
+        <w:gridCol w:w="10080"/>
+      </w:tblGrid>
+      <w:tr>
+        <w:tc>
+          <w:tcPr>
+            <w:tcW w:type="dxa" w:w="10080"/>
+            <w:shd w:fill="F2F6FA"/>
+          </w:tcPr>
+          <w:p>
+            <w:r>
+              <w:rPr>
+                <w:rFonts w:ascii="Aptos" w:hAnsi="Aptos"/>
+                <w:sz w:val="18"/>
+              </w:rPr>
+              <w:t>Audit the repository structure, documentation, ignore rules, secret handling, YAML, and Compose files. Propose the minimum source-of-truth structure without changing the live system.</w:t>
+            </w:r>
+          </w:p>
+        </w:tc>
+      </w:tr>
+    </w:tbl>
+    <w:p/>
+    <w:p>
+      <w:pPr>
+        <w:pStyle w:val="Heading2"/>
+      </w:pPr>
+      <w:r>
+        <w:t>Why this stage was needed</w:t>
+      </w:r>
+    </w:p>
+    <w:p>
+      <w:r>
+        <w:t>Infrastructure cannot be maintained safely when decisions exist only in terminal history.</w:t>
+      </w:r>
+    </w:p>
+    <w:p>
+      <w:pPr>
+        <w:pStyle w:val="Heading2"/>
+      </w:pPr>
+      <w:r>
+        <w:t>What was created</w:t>
+      </w:r>
+    </w:p>
+    <w:p>
+      <w:r>
+        <w:t>Repository layout, agent rules, environment template, ADR process, documentation, tests, scripts, and rollback conventions.</w:t>
+      </w:r>
+    </w:p>
+    <w:p>
+      <w:pPr>
+        <w:pStyle w:val="Heading2"/>
+      </w:pPr>
+      <w:r>
+        <w:t>Execution result</w:t>
+      </w:r>
+    </w:p>
+    <w:p>
+      <w:r>
+        <w:rPr>
+          <w:b/>
+        </w:rPr>
+        <w:t>The repository became the source of truth while real secrets stayed in ignored local configuration.</w:t>
+      </w:r>
+    </w:p>
+    <w:p>
+      <w:pPr>
+        <w:pStyle w:val="Heading2"/>
+      </w:pPr>
+      <w:r>
+        <w:t>How to verify it</w:t>
+      </w:r>
+    </w:p>
+    <w:p>
+      <w:pPr>
+        <w:pStyle w:val="ListBullet"/>
+      </w:pPr>
+      <w:r>
+        <w:t>Check tracked files, ignore rules, Compose rendering, documentation links, and secret patterns.</w:t>
+      </w:r>
+    </w:p>
+    <w:p>
+      <w:pPr>
+        <w:pStyle w:val="Heading2"/>
+      </w:pPr>
+      <w:r>
+        <w:t>Engineering lesson</w:t>
+      </w:r>
+    </w:p>
+    <w:p>
+      <w:r>
+        <w:t>Safety constraints must live next to code so they survive context and operator changes.</w:t>
+      </w:r>
+    </w:p>
+    <w:p>
+      <w:pPr>
+        <w:pStyle w:val="Heading2"/>
+      </w:pPr>
+      <w:r>
+        <w:t>Completion criterion</w:t>
+      </w:r>
+    </w:p>
+    <w:p>
+      <w:r>
+        <w:t>The stage is complete only when the result is reproducible from the repository, verification passes without disclosing sensitive data, rollback is clear, and remaining risks are recorded.</w:t>
+      </w:r>
+    </w:p>
+    <w:p>
+      <w:r>
+        <w:br w:type="page"/>
+      </w:r>
+    </w:p>
+    <w:p>
+      <w:pPr>
+        <w:pStyle w:val="Heading1"/>
+      </w:pPr>
+      <w:r>
+        <w:t>3. Perform a read-only hardware audit</w:t>
+      </w:r>
+    </w:p>
+    <w:p>
+      <w:pPr>
+        <w:pStyle w:val="Heading2"/>
+      </w:pPr>
+      <w:r>
+        <w:t>Plan clarification — send separately</w:t>
+      </w:r>
+    </w:p>
+    <w:tbl>
+      <w:tblPr>
+        <w:tblW w:type="auto" w:w="0"/>
+        <w:jc w:val="center"/>
+        <w:tblLook w:firstColumn="1" w:firstRow="1" w:lastColumn="0" w:lastRow="0" w:noHBand="0" w:noVBand="1" w:val="04A0"/>
+      </w:tblPr>
+      <w:tblGrid>
+        <w:gridCol w:w="10080"/>
+      </w:tblGrid>
+      <w:tr>
+        <w:tc>
+          <w:tcPr>
+            <w:tcW w:type="dxa" w:w="10080"/>
+            <w:shd w:fill="F2F6FA"/>
+          </w:tcPr>
+          <w:p>
+            <w:r>
+              <w:rPr>
+                <w:rFonts w:ascii="Aptos" w:hAnsi="Aptos"/>
+                <w:sz w:val="18"/>
+              </w:rPr>
+              <w:t>Collect the operating system, kernel, CPU architecture, memory, swap, block devices, mounts, USB topology, network interfaces, Docker version, and temperatures without changing the device.</w:t>
+            </w:r>
+          </w:p>
+        </w:tc>
+      </w:tr>
+    </w:tbl>
+    <w:p/>
+    <w:p>
+      <w:pPr>
+        <w:pStyle w:val="Heading2"/>
+      </w:pPr>
+      <w:r>
+        <w:t>Why this stage was needed</w:t>
+      </w:r>
+    </w:p>
+    <w:p>
+      <w:r>
+        <w:t>Datasheets do not describe the actual state of a specific device and attached storage.</w:t>
+      </w:r>
+    </w:p>
+    <w:p>
+      <w:pPr>
+        <w:pStyle w:val="Heading2"/>
+      </w:pPr>
+      <w:r>
+        <w:t>What was created</w:t>
+      </w:r>
+    </w:p>
+    <w:p>
+      <w:r>
+        <w:t>A reproducible hardware inventory and a risk assessment for ARM64, JetPack, RAM, microSD, and USB storage.</w:t>
+      </w:r>
+    </w:p>
+    <w:p>
+      <w:pPr>
+        <w:pStyle w:val="Heading2"/>
+      </w:pPr>
+      <w:r>
+        <w:t>Execution result</w:t>
+      </w:r>
+    </w:p>
+    <w:p>
+      <w:r>
+        <w:rPr>
+          <w:b/>
+        </w:rPr>
+        <w:t>The live platform was confirmed as Jetson Nano 4 GB on the legacy Tegra stack, with an external SSD and compressed zram swap.</w:t>
+      </w:r>
+    </w:p>
+    <w:p>
+      <w:pPr>
+        <w:pStyle w:val="Heading2"/>
+      </w:pPr>
+      <w:r>
+        <w:t>How to verify it</w:t>
+      </w:r>
+    </w:p>
+    <w:p>
+      <w:pPr>
+        <w:pStyle w:val="ListBullet"/>
+      </w:pPr>
+      <w:r>
+        <w:t>Repeat read-only system, memory, USB, mount, and Docker-version checks.</w:t>
+      </w:r>
+    </w:p>
+    <w:p>
+      <w:pPr>
+        <w:pStyle w:val="Heading2"/>
+      </w:pPr>
+      <w:r>
+        <w:t>Engineering lesson</w:t>
+      </w:r>
+    </w:p>
+    <w:p>
+      <w:r>
+        <w:t>Time-sensitive values such as swap, free space, and application versions require dated evidence.</w:t>
+      </w:r>
+    </w:p>
+    <w:p>
+      <w:pPr>
+        <w:pStyle w:val="Heading2"/>
+      </w:pPr>
+      <w:r>
+        <w:t>Completion criterion</w:t>
+      </w:r>
+    </w:p>
+    <w:p>
+      <w:r>
+        <w:t>The stage is complete only when the result is reproducible from the repository, verification passes without disclosing sensitive data, rollback is clear, and remaining risks are recorded.</w:t>
+      </w:r>
+    </w:p>
+    <w:p>
+      <w:r>
+        <w:br w:type="page"/>
+      </w:r>
+    </w:p>
+    <w:p>
+      <w:pPr>
+        <w:pStyle w:val="Heading1"/>
+      </w:pPr>
+      <w:r>
+        <w:t>4. Design and prepare storage</w:t>
+      </w:r>
+    </w:p>
+    <w:p>
+      <w:pPr>
+        <w:pStyle w:val="Heading2"/>
+      </w:pPr>
+      <w:r>
+        <w:t>Plan clarification — send separately</w:t>
+      </w:r>
+    </w:p>
+    <w:tbl>
+      <w:tblPr>
+        <w:tblW w:type="auto" w:w="0"/>
+        <w:jc w:val="center"/>
+        <w:tblLook w:firstColumn="1" w:firstRow="1" w:lastColumn="0" w:lastRow="0" w:noHBand="0" w:noVBand="1" w:val="04A0"/>
+      </w:tblPr>
+      <w:tblGrid>
+        <w:gridCol w:w="10080"/>
+      </w:tblGrid>
+      <w:tr>
+        <w:tc>
+          <w:tcPr>
+            <w:tcW w:type="dxa" w:w="10080"/>
+            <w:shd w:fill="F2F6FA"/>
+          </w:tcPr>
+          <w:p>
+            <w:r>
+              <w:rPr>
+                <w:rFonts w:ascii="Aptos" w:hAnsi="Aptos"/>
+                <w:sz w:val="18"/>
+              </w:rPr>
+              <w:t>Design the external storage mount, directory layout, expected filesystem identity, and fail-closed preflight. Do not format or modify partitions without separate approval.</w:t>
+            </w:r>
+          </w:p>
+        </w:tc>
+      </w:tr>
+    </w:tbl>
+    <w:p/>
+    <w:p>
+      <w:pPr>
+        <w:pStyle w:val="Heading2"/>
+      </w:pPr>
+      <w:r>
+        <w:t>Why this stage was needed</w:t>
+      </w:r>
+    </w:p>
+    <w:p>
+      <w:r>
+        <w:t>If the USB disk is absent, Docker may silently create data directories on the system microSD.</w:t>
+      </w:r>
+    </w:p>
+    <w:p>
+      <w:pPr>
+        <w:pStyle w:val="Heading2"/>
+      </w:pPr>
+      <w:r>
+        <w:t>What was created</w:t>
+      </w:r>
+    </w:p>
+    <w:p>
+      <w:r>
+        <w:t>Storage design, mount checks, preflight guard, systemd dependencies, application data directories, and backup locations.</w:t>
+      </w:r>
+    </w:p>
+    <w:p>
+      <w:pPr>
+        <w:pStyle w:val="Heading2"/>
+      </w:pPr>
+      <w:r>
+        <w:t>Execution result</w:t>
+      </w:r>
+    </w:p>
+    <w:p>
+      <w:r>
+        <w:rPr>
+          <w:b/>
+        </w:rPr>
+        <w:t>The external ext4 SSD is mounted as the data root and storage-backed services depend on a successful preflight.</w:t>
+      </w:r>
+    </w:p>
+    <w:p>
+      <w:pPr>
+        <w:pStyle w:val="Heading2"/>
+      </w:pPr>
+      <w:r>
+        <w:t>How to verify it</w:t>
+      </w:r>
+    </w:p>
+    <w:p>
+      <w:pPr>
+        <w:pStyle w:val="ListBullet"/>
+      </w:pPr>
+      <w:r>
+        <w:t>Verify the mount source, filesystem, capacity, free space, expected identity, and preflight exit status.</w:t>
+      </w:r>
+    </w:p>
+    <w:p>
+      <w:pPr>
+        <w:pStyle w:val="Heading2"/>
+      </w:pPr>
+      <w:r>
+        <w:t>Engineering lesson</w:t>
+      </w:r>
+    </w:p>
+    <w:p>
+      <w:r>
+        <w:t>A directory existing is not proof that the intended disk is mounted beneath it.</w:t>
+      </w:r>
+    </w:p>
+    <w:p>
+      <w:pPr>
+        <w:pStyle w:val="Heading2"/>
+      </w:pPr>
+      <w:r>
+        <w:t>Completion criterion</w:t>
+      </w:r>
+    </w:p>
+    <w:p>
+      <w:r>
+        <w:t>The stage is complete only when the result is reproducible from the repository, verification passes without disclosing sensitive data, rollback is clear, and remaining risks are recorded.</w:t>
+      </w:r>
+    </w:p>
+    <w:p>
+      <w:r>
+        <w:br w:type="page"/>
+      </w:r>
+    </w:p>
+    <w:p>
+      <w:pPr>
+        <w:pStyle w:val="Heading1"/>
+      </w:pPr>
+      <w:r>
+        <w:t>5. Build the modular Docker architecture</w:t>
+      </w:r>
+    </w:p>
+    <w:p>
+      <w:pPr>
+        <w:pStyle w:val="Heading2"/>
+      </w:pPr>
+      <w:r>
+        <w:t>Plan clarification — send separately</w:t>
+      </w:r>
+    </w:p>
+    <w:tbl>
+      <w:tblPr>
+        <w:tblW w:type="auto" w:w="0"/>
+        <w:jc w:val="center"/>
+        <w:tblLook w:firstColumn="1" w:firstRow="1" w:lastColumn="0" w:lastRow="0" w:noHBand="0" w:noVBand="1" w:val="04A0"/>
+      </w:tblPr>
+      <w:tblGrid>
+        <w:gridCol w:w="10080"/>
+      </w:tblGrid>
+      <w:tr>
+        <w:tc>
+          <w:tcPr>
+            <w:tcW w:type="dxa" w:w="10080"/>
+            <w:shd w:fill="F2F6FA"/>
+          </w:tcPr>
+          <w:p>
+            <w:r>
+              <w:rPr>
+                <w:rFonts w:ascii="Aptos" w:hAnsi="Aptos"/>
+                <w:sz w:val="18"/>
+              </w:rPr>
+              <w:t>Create separate Compose blocks for core applications, monitoring, Samba, the gateway, and the API. Use ARM64-compatible images, restart policies, mounts, an internal network, and healthchecks where supported.</w:t>
+            </w:r>
+          </w:p>
+        </w:tc>
+      </w:tr>
+    </w:tbl>
+    <w:p/>
+    <w:p>
+      <w:pPr>
+        <w:pStyle w:val="Heading2"/>
+      </w:pPr>
+      <w:r>
+        <w:t>Why this stage was needed</w:t>
+      </w:r>
+    </w:p>
+    <w:p>
+      <w:r>
+        <w:t>A single monolithic Compose file would make diagnosis and rollback unnecessarily risky.</w:t>
+      </w:r>
+    </w:p>
+    <w:p>
+      <w:pPr>
+        <w:pStyle w:val="Heading2"/>
+      </w:pPr>
+      <w:r>
+        <w:t>What was created</w:t>
+      </w:r>
+    </w:p>
+    <w:p>
+      <w:r>
+        <w:t>Modular Compose definitions and an internal application network.</w:t>
+      </w:r>
+    </w:p>
+    <w:p>
+      <w:pPr>
+        <w:pStyle w:val="Heading2"/>
+      </w:pPr>
+      <w:r>
+        <w:t>Execution result</w:t>
+      </w:r>
+    </w:p>
+    <w:p>
+      <w:r>
+        <w:rPr>
+          <w:b/>
+        </w:rPr>
+        <w:t>Thirteen containers run in the live stack; twelve expose a healthy status, while Portainer has no healthcheck configured.</w:t>
+      </w:r>
+    </w:p>
+    <w:p>
+      <w:pPr>
+        <w:pStyle w:val="Heading2"/>
+      </w:pPr>
+      <w:r>
+        <w:t>How to verify it</w:t>
+      </w:r>
+    </w:p>
+    <w:p>
+      <w:pPr>
+        <w:pStyle w:val="ListBullet"/>
+      </w:pPr>
+      <w:r>
+        <w:t>Render Compose configuration, list containers, inspect health state, mounts, and networks.</w:t>
+      </w:r>
+    </w:p>
+    <w:p>
+      <w:pPr>
+        <w:pStyle w:val="Heading2"/>
+      </w:pPr>
+      <w:r>
+        <w:t>Engineering lesson</w:t>
+      </w:r>
+    </w:p>
+    <w:p>
+      <w:r>
+        <w:t>Running and healthy are different states and must not be reported as synonyms.</w:t>
+      </w:r>
+    </w:p>
+    <w:p>
+      <w:pPr>
+        <w:pStyle w:val="Heading2"/>
+      </w:pPr>
+      <w:r>
+        <w:t>Completion criterion</w:t>
+      </w:r>
+    </w:p>
+    <w:p>
+      <w:r>
+        <w:t>The stage is complete only when the result is reproducible from the repository, verification passes without disclosing sensitive data, rollback is clear, and remaining risks are recorded.</w:t>
+      </w:r>
+    </w:p>
+    <w:p>
+      <w:r>
+        <w:br w:type="page"/>
+      </w:r>
+    </w:p>
+    <w:p>
+      <w:pPr>
+        <w:pStyle w:val="Heading1"/>
+      </w:pPr>
+      <w:r>
+        <w:t>6. Deploy Nextcloud</w:t>
+      </w:r>
+    </w:p>
+    <w:p>
+      <w:pPr>
+        <w:pStyle w:val="Heading2"/>
+      </w:pPr>
+      <w:r>
+        <w:t>Plan clarification — send separately</w:t>
+      </w:r>
+    </w:p>
+    <w:tbl>
+      <w:tblPr>
+        <w:tblW w:type="auto" w:w="0"/>
+        <w:jc w:val="center"/>
+        <w:tblLook w:firstColumn="1" w:firstRow="1" w:lastColumn="0" w:lastRow="0" w:noHBand="0" w:noVBand="1" w:val="04A0"/>
+      </w:tblPr>
+      <w:tblGrid>
+        <w:gridCol w:w="10080"/>
+      </w:tblGrid>
+      <w:tr>
+        <w:tc>
+          <w:tcPr>
+            <w:tcW w:type="dxa" w:w="10080"/>
+            <w:shd w:fill="F2F6FA"/>
+          </w:tcPr>
+          <w:p>
+            <w:r>
+              <w:rPr>
+                <w:rFonts w:ascii="Aptos" w:hAnsi="Aptos"/>
+                <w:sz w:val="18"/>
+              </w:rPr>
+              <w:t>Deploy Nextcloud with PostgreSQL and Redis after checking local configuration, storage, ports, and the internal network. Keep it off the home router's public interface.</w:t>
+            </w:r>
+          </w:p>
+        </w:tc>
+      </w:tr>
+    </w:tbl>
+    <w:p/>
+    <w:p>
+      <w:pPr>
+        <w:pStyle w:val="Heading2"/>
+      </w:pPr>
+      <w:r>
+        <w:t>Why this stage was needed</w:t>
+      </w:r>
+    </w:p>
+    <w:p>
+      <w:r>
+        <w:t>Nextcloud combines files, CardDAV, CalDAV, and family communication in one manageable service.</w:t>
+      </w:r>
+    </w:p>
+    <w:p>
+      <w:pPr>
+        <w:pStyle w:val="Heading2"/>
+      </w:pPr>
+      <w:r>
+        <w:t>What was created</w:t>
+      </w:r>
+    </w:p>
+    <w:p>
+      <w:r>
+        <w:t>Nextcloud, its database and cache, persistent data paths, trusted-host configuration, and user runbooks.</w:t>
+      </w:r>
+    </w:p>
+    <w:p>
+      <w:pPr>
+        <w:pStyle w:val="Heading2"/>
+      </w:pPr>
+      <w:r>
+        <w:t>Execution result</w:t>
+      </w:r>
+    </w:p>
+    <w:p>
+      <w:r>
+        <w:rPr>
+          <w:b/>
+        </w:rPr>
+        <w:t>Nextcloud is live, its local and relayed health endpoints respond, and the family user count was verified without exposing identities.</w:t>
+      </w:r>
+    </w:p>
+    <w:p>
+      <w:pPr>
+        <w:pStyle w:val="Heading2"/>
+      </w:pPr>
+      <w:r>
+        <w:t>How to verify it</w:t>
+      </w:r>
+    </w:p>
+    <w:p>
+      <w:pPr>
+        <w:pStyle w:val="ListBullet"/>
+      </w:pPr>
+      <w:r>
+        <w:t>Check the status endpoint, application status command, maintenance state, database/cache connectivity, and persistence after restart.</w:t>
+      </w:r>
+    </w:p>
+    <w:p>
+      <w:pPr>
+        <w:pStyle w:val="Heading2"/>
+      </w:pPr>
+      <w:r>
+        <w:t>Engineering lesson</w:t>
+      </w:r>
+    </w:p>
+    <w:p>
+      <w:r>
+        <w:t>An HTTP response alone does not prove that the application is installed, healthy, and connected to its dependencies.</w:t>
+      </w:r>
+    </w:p>
+    <w:p>
+      <w:pPr>
+        <w:pStyle w:val="Heading2"/>
+      </w:pPr>
+      <w:r>
+        <w:t>Completion criterion</w:t>
+      </w:r>
+    </w:p>
+    <w:p>
+      <w:r>
+        <w:t>The stage is complete only when the result is reproducible from the repository, verification passes without disclosing sensitive data, rollback is clear, and remaining risks are recorded.</w:t>
+      </w:r>
+    </w:p>
+    <w:p>
+      <w:r>
+        <w:br w:type="page"/>
+      </w:r>
+    </w:p>
+    <w:p>
+      <w:pPr>
+        <w:pStyle w:val="Heading1"/>
+      </w:pPr>
+      <w:r>
+        <w:t>7. Deploy Immich in a resource-conscious mode</w:t>
+      </w:r>
+    </w:p>
+    <w:p>
+      <w:pPr>
+        <w:pStyle w:val="Heading2"/>
+      </w:pPr>
+      <w:r>
+        <w:t>Plan clarification — send separately</w:t>
+      </w:r>
+    </w:p>
+    <w:tbl>
+      <w:tblPr>
+        <w:tblW w:type="auto" w:w="0"/>
+        <w:jc w:val="center"/>
+        <w:tblLook w:firstColumn="1" w:firstRow="1" w:lastColumn="0" w:lastRow="0" w:noHBand="0" w:noVBand="1" w:val="04A0"/>
+      </w:tblPr>
+      <w:tblGrid>
+        <w:gridCol w:w="10080"/>
+      </w:tblGrid>
+      <w:tr>
+        <w:tc>
+          <w:tcPr>
+            <w:tcW w:type="dxa" w:w="10080"/>
+            <w:shd w:fill="F2F6FA"/>
+          </w:tcPr>
+          <w:p>
+            <w:r>
+              <w:rPr>
+                <w:rFonts w:ascii="Aptos" w:hAnsi="Aptos"/>
+                <w:sz w:val="18"/>
+              </w:rPr>
+              <w:t>Deploy Immich with PostgreSQL and Redis on ARM64. Keep machine learning disabled, store data externally, and expose only aggregate media statistics.</w:t>
+            </w:r>
+          </w:p>
+        </w:tc>
+      </w:tr>
+    </w:tbl>
+    <w:p/>
+    <w:p>
+      <w:pPr>
+        <w:pStyle w:val="Heading2"/>
+      </w:pPr>
+      <w:r>
+        <w:t>Why this stage was needed</w:t>
+      </w:r>
+    </w:p>
+    <w:p>
+      <w:r>
+        <w:t>Face and object recognition would compete with core services for scarce memory and CPU.</w:t>
+      </w:r>
+    </w:p>
+    <w:p>
+      <w:pPr>
+        <w:pStyle w:val="Heading2"/>
+      </w:pPr>
+      <w:r>
+        <w:t>What was created</w:t>
+      </w:r>
+    </w:p>
+    <w:p>
+      <w:r>
+        <w:t>Immich services, database, cache, storage layout, mobile onboarding, and privacy-safe screenshots.</w:t>
+      </w:r>
+    </w:p>
+    <w:p>
+      <w:pPr>
+        <w:pStyle w:val="Heading2"/>
+      </w:pPr>
+      <w:r>
+        <w:t>Execution result</w:t>
+      </w:r>
+    </w:p>
+    <w:p>
+      <w:r>
+        <w:rPr>
+          <w:b/>
+        </w:rPr>
+        <w:t>Immich is live with ML disabled; the current database contains aggregated active image and video counts recorded in the Russian section.</w:t>
+      </w:r>
+    </w:p>
+    <w:p>
+      <w:pPr>
+        <w:pStyle w:val="Heading2"/>
+      </w:pPr>
+      <w:r>
+        <w:t>How to verify it</w:t>
+      </w:r>
+    </w:p>
+    <w:p>
+      <w:pPr>
+        <w:pStyle w:val="ListBullet"/>
+      </w:pPr>
+      <w:r>
+        <w:t>Check the ping and version endpoints and use a read-only aggregate database query that excludes deleted assets.</w:t>
+      </w:r>
+    </w:p>
+    <w:p>
+      <w:pPr>
+        <w:pStyle w:val="Heading2"/>
+      </w:pPr>
+      <w:r>
+        <w:t>Engineering lesson</w:t>
+      </w:r>
+    </w:p>
+    <w:p>
+      <w:r>
+        <w:t>Mobile upload queues, phone gallery totals, and active database assets are different measurements.</w:t>
+      </w:r>
+    </w:p>
+    <w:p>
+      <w:pPr>
+        <w:pStyle w:val="Heading2"/>
+      </w:pPr>
+      <w:r>
+        <w:t>Completion criterion</w:t>
+      </w:r>
+    </w:p>
+    <w:p>
+      <w:r>
+        <w:t>The stage is complete only when the result is reproducible from the repository, verification passes without disclosing sensitive data, rollback is clear, and remaining risks are recorded.</w:t>
+      </w:r>
+    </w:p>
+    <w:p>
+      <w:r>
+        <w:br w:type="page"/>
+      </w:r>
+    </w:p>
+    <w:p>
+      <w:pPr>
+        <w:pStyle w:val="Heading1"/>
+      </w:pPr>
+      <w:r>
+        <w:t>8. Provide LAN-only Samba access</w:t>
+      </w:r>
+    </w:p>
+    <w:p>
+      <w:pPr>
+        <w:pStyle w:val="Heading2"/>
+      </w:pPr>
+      <w:r>
+        <w:t>Plan clarification — send separately</w:t>
+      </w:r>
+    </w:p>
+    <w:tbl>
+      <w:tblPr>
+        <w:tblW w:type="auto" w:w="0"/>
+        <w:jc w:val="center"/>
+        <w:tblLook w:firstColumn="1" w:firstRow="1" w:lastColumn="0" w:lastRow="0" w:noHBand="0" w:noVBand="1" w:val="04A0"/>
+      </w:tblPr>
+      <w:tblGrid>
+        <w:gridCol w:w="10080"/>
+      </w:tblGrid>
+      <w:tr>
+        <w:tc>
+          <w:tcPr>
+            <w:tcW w:type="dxa" w:w="10080"/>
+            <w:shd w:fill="F2F6FA"/>
+          </w:tcPr>
+          <w:p>
+            <w:r>
+              <w:rPr>
+                <w:rFonts w:ascii="Aptos" w:hAnsi="Aptos"/>
+                <w:sz w:val="18"/>
+              </w:rPr>
+              <w:t>Deploy Samba only for the private LAN. Read credentials from ignored local configuration, define safe shares, verify permissions, and prove that SMB is absent from the public tunnel.</w:t>
+            </w:r>
+          </w:p>
+        </w:tc>
+      </w:tr>
+    </w:tbl>
+    <w:p/>
+    <w:p>
+      <w:pPr>
+        <w:pStyle w:val="Heading2"/>
+      </w:pPr>
+      <w:r>
+        <w:t>Why this stage was needed</w:t>
+      </w:r>
+    </w:p>
+    <w:p>
+      <w:r>
+        <w:t>SMB is convenient inside the home network but must never be exposed directly to the Internet.</w:t>
+      </w:r>
+    </w:p>
+    <w:p>
+      <w:pPr>
+        <w:pStyle w:val="Heading2"/>
+      </w:pPr>
+      <w:r>
+        <w:t>What was created</w:t>
+      </w:r>
+    </w:p>
+    <w:p>
+      <w:r>
+        <w:t>Samba Compose definition, shares, LAN restrictions, local instructions, and secret handling outside Git.</w:t>
+      </w:r>
+    </w:p>
+    <w:p>
+      <w:pPr>
+        <w:pStyle w:val="Heading2"/>
+      </w:pPr>
+      <w:r>
+        <w:t>Execution result</w:t>
+      </w:r>
+    </w:p>
+    <w:p>
+      <w:r>
+        <w:rPr>
+          <w:b/>
+        </w:rPr>
+        <w:t>The Samba container is running and restricted to local access; no SMB forwarding exists on the VPS path.</w:t>
+      </w:r>
+    </w:p>
+    <w:p>
+      <w:pPr>
+        <w:pStyle w:val="Heading2"/>
+      </w:pPr>
+      <w:r>
+        <w:t>How to verify it</w:t>
+      </w:r>
+    </w:p>
+    <w:p>
+      <w:pPr>
+        <w:pStyle w:val="ListBullet"/>
+      </w:pPr>
+      <w:r>
+        <w:t>Test local port reachability and authorized file operations, then confirm no public or reverse forwarding exists for SMB.</w:t>
+      </w:r>
+    </w:p>
+    <w:p>
+      <w:pPr>
+        <w:pStyle w:val="Heading2"/>
+      </w:pPr>
+      <w:r>
+        <w:t>Engineering lesson</w:t>
+      </w:r>
+    </w:p>
+    <w:p>
+      <w:r>
+        <w:t>Network isolation should be enforced by several independent layers.</w:t>
+      </w:r>
+    </w:p>
+    <w:p>
+      <w:pPr>
+        <w:pStyle w:val="Heading2"/>
+      </w:pPr>
+      <w:r>
+        <w:t>Completion criterion</w:t>
+      </w:r>
+    </w:p>
+    <w:p>
+      <w:r>
+        <w:t>The stage is complete only when the result is reproducible from the repository, verification passes without disclosing sensitive data, rollback is clear, and remaining risks are recorded.</w:t>
+      </w:r>
+    </w:p>
+    <w:p>
+      <w:r>
+        <w:br w:type="page"/>
+      </w:r>
+    </w:p>
+    <w:p>
+      <w:pPr>
+        <w:pStyle w:val="Heading1"/>
+      </w:pPr>
+      <w:r>
+        <w:t>9. Create a privacy-aware LLM Gateway</w:t>
+      </w:r>
+    </w:p>
+    <w:p>
+      <w:pPr>
+        <w:pStyle w:val="Heading2"/>
+      </w:pPr>
+      <w:r>
+        <w:t>Plan clarification — send separately</w:t>
+      </w:r>
+    </w:p>
+    <w:tbl>
+      <w:tblPr>
+        <w:tblW w:type="auto" w:w="0"/>
+        <w:jc w:val="center"/>
+        <w:tblLook w:firstColumn="1" w:firstRow="1" w:lastColumn="0" w:lastRow="0" w:noHBand="0" w:noVBand="1" w:val="04A0"/>
+      </w:tblPr>
+      <w:tblGrid>
+        <w:gridCol w:w="10080"/>
+      </w:tblGrid>
+      <w:tr>
+        <w:tc>
+          <w:tcPr>
+            <w:tcW w:type="dxa" w:w="10080"/>
+            <w:shd w:fill="F2F6FA"/>
+          </w:tcPr>
+          <w:p>
+            <w:r>
+              <w:rPr>
+                <w:rFonts w:ascii="Aptos" w:hAnsi="Aptos"/>
+                <w:sz w:val="18"/>
+              </w:rPr>
+              <w:t>Implement a health endpoint, mock mode, redaction, safe external API access, environment-only credentials, and tests using synthetic data. Prohibit personal cloud content from leaving the system.</w:t>
+            </w:r>
+          </w:p>
+        </w:tc>
+      </w:tr>
+    </w:tbl>
+    <w:p/>
+    <w:p>
+      <w:pPr>
+        <w:pStyle w:val="Heading2"/>
+      </w:pPr>
+      <w:r>
+        <w:t>Why this stage was needed</w:t>
+      </w:r>
+    </w:p>
+    <w:p>
+      <w:r>
+        <w:t>A home cloud contains highly sensitive family data, even when an external LLM is useful for administration.</w:t>
+      </w:r>
+    </w:p>
+    <w:p>
+      <w:pPr>
+        <w:pStyle w:val="Heading2"/>
+      </w:pPr>
+      <w:r>
+        <w:t>What was created</w:t>
+      </w:r>
+    </w:p>
+    <w:p>
+      <w:r>
+        <w:t>LLM Gateway, redaction logic, mock mode, healthcheck, tests, and a privacy policy.</w:t>
+      </w:r>
+    </w:p>
+    <w:p>
+      <w:pPr>
+        <w:pStyle w:val="Heading2"/>
+      </w:pPr>
+      <w:r>
+        <w:t>Execution result</w:t>
+      </w:r>
+    </w:p>
+    <w:p>
+      <w:r>
+        <w:rPr>
+          <w:b/>
+        </w:rPr>
+        <w:t>The gateway is running and healthy; no local LLM was deployed on Jetson during Stage 1.</w:t>
+      </w:r>
+    </w:p>
+    <w:p>
+      <w:pPr>
+        <w:pStyle w:val="Heading2"/>
+      </w:pPr>
+      <w:r>
+        <w:t>How to verify it</w:t>
+      </w:r>
+    </w:p>
+    <w:p>
+      <w:pPr>
+        <w:pStyle w:val="ListBullet"/>
+      </w:pPr>
+      <w:r>
+        <w:t>Test health, mock behavior, redaction with synthetic inputs, and absence of credentials in the Git diff.</w:t>
+      </w:r>
+    </w:p>
+    <w:p>
+      <w:pPr>
+        <w:pStyle w:val="Heading2"/>
+      </w:pPr>
+      <w:r>
+        <w:t>Engineering lesson</w:t>
+      </w:r>
+    </w:p>
+    <w:p>
+      <w:r>
+        <w:t>A proxy is not a privacy boundary unless it classifies and restricts data.</w:t>
+      </w:r>
+    </w:p>
+    <w:p>
+      <w:pPr>
+        <w:pStyle w:val="Heading2"/>
+      </w:pPr>
+      <w:r>
+        <w:t>Completion criterion</w:t>
+      </w:r>
+    </w:p>
+    <w:p>
+      <w:r>
+        <w:t>The stage is complete only when the result is reproducible from the repository, verification passes without disclosing sensitive data, rollback is clear, and remaining risks are recorded.</w:t>
+      </w:r>
+    </w:p>
+    <w:p>
+      <w:r>
+        <w:br w:type="page"/>
+      </w:r>
+    </w:p>
+    <w:p>
+      <w:pPr>
+        <w:pStyle w:val="Heading1"/>
+      </w:pPr>
+      <w:r>
+        <w:t>10. Stabilize local networking</w:t>
+      </w:r>
+    </w:p>
+    <w:p>
+      <w:pPr>
+        <w:pStyle w:val="Heading2"/>
+      </w:pPr>
+      <w:r>
+        <w:t>Plan clarification — send separately</w:t>
+      </w:r>
+    </w:p>
+    <w:tbl>
+      <w:tblPr>
+        <w:tblW w:type="auto" w:w="0"/>
+        <w:jc w:val="center"/>
+        <w:tblLook w:firstColumn="1" w:firstRow="1" w:lastColumn="0" w:lastRow="0" w:noHBand="0" w:noVBand="1" w:val="04A0"/>
+      </w:tblPr>
+      <w:tblGrid>
+        <w:gridCol w:w="10080"/>
+      </w:tblGrid>
+      <w:tr>
+        <w:tc>
+          <w:tcPr>
+            <w:tcW w:type="dxa" w:w="10080"/>
+            <w:shd w:fill="F2F6FA"/>
+          </w:tcPr>
+          <w:p>
+            <w:r>
+              <w:rPr>
+                <w:rFonts w:ascii="Aptos" w:hAnsi="Aptos"/>
+                <w:sz w:val="18"/>
+              </w:rPr>
+              <w:t>Inventory the private LAN, gateway role, Jetson profile, address reservation, local DNS options, and IP-conflict checks without changing router, VPN, firewall, or Wi-Fi settings.</w:t>
+            </w:r>
+          </w:p>
+        </w:tc>
+      </w:tr>
+    </w:tbl>
+    <w:p/>
+    <w:p>
+      <w:pPr>
+        <w:pStyle w:val="Heading2"/>
+      </w:pPr>
+      <w:r>
+        <w:t>Why this stage was needed</w:t>
+      </w:r>
+    </w:p>
+    <w:p>
+      <w:r>
+        <w:t>All service URLs and the reverse tunnel depend on stable local addressing.</w:t>
+      </w:r>
+    </w:p>
+    <w:p>
+      <w:pPr>
+        <w:pStyle w:val="Heading2"/>
+      </w:pPr>
+      <w:r>
+        <w:t>What was created</w:t>
+      </w:r>
+    </w:p>
+    <w:p>
+      <w:r>
+        <w:t>Network inventory, LAN-only ADR, port table, persistent addressing, and diagnostic commands.</w:t>
+      </w:r>
+    </w:p>
+    <w:p>
+      <w:pPr>
+        <w:pStyle w:val="Heading2"/>
+      </w:pPr>
+      <w:r>
+        <w:t>Execution result</w:t>
+      </w:r>
+    </w:p>
+    <w:p>
+      <w:r>
+        <w:rPr>
+          <w:b/>
+        </w:rPr>
+        <w:t>Jetson uses a stable private address; services are reachable on the LAN and no home-router port forwarding is used.</w:t>
+      </w:r>
+    </w:p>
+    <w:p>
+      <w:pPr>
+        <w:pStyle w:val="Heading2"/>
+      </w:pPr>
+      <w:r>
+        <w:t>How to verify it</w:t>
+      </w:r>
+    </w:p>
+    <w:p>
+      <w:pPr>
+        <w:pStyle w:val="ListBullet"/>
+      </w:pPr>
+      <w:r>
+        <w:t>Check interface addresses, routes, the active network profile, and LAN connectivity from an administrative workstation.</w:t>
+      </w:r>
+    </w:p>
+    <w:p>
+      <w:pPr>
+        <w:pStyle w:val="Heading2"/>
+      </w:pPr>
+      <w:r>
+        <w:t>Engineering lesson</w:t>
+      </w:r>
+    </w:p>
+    <w:p>
+      <w:r>
+        <w:t>A future router migration must reproduce the existing LAN first instead of changing every network variable at once.</w:t>
+      </w:r>
+    </w:p>
+    <w:p>
+      <w:pPr>
+        <w:pStyle w:val="Heading2"/>
+      </w:pPr>
+      <w:r>
+        <w:t>Completion criterion</w:t>
+      </w:r>
+    </w:p>
+    <w:p>
+      <w:r>
+        <w:t>The stage is complete only when the result is reproducible from the repository, verification passes without disclosing sensitive data, rollback is clear, and remaining risks are recorded.</w:t>
+      </w:r>
+    </w:p>
+    <w:p>
+      <w:r>
+        <w:br w:type="page"/>
+      </w:r>
+    </w:p>
+    <w:p>
+      <w:pPr>
+        <w:pStyle w:val="Heading1"/>
+      </w:pPr>
+      <w:r>
+        <w:t>11. Implement external access through a VPS reverse tunnel</w:t>
+      </w:r>
+    </w:p>
+    <w:p>
+      <w:pPr>
+        <w:pStyle w:val="Heading2"/>
+      </w:pPr>
+      <w:r>
+        <w:t>Plan clarification — send separately</w:t>
+      </w:r>
+    </w:p>
+    <w:tbl>
+      <w:tblPr>
+        <w:tblW w:type="auto" w:w="0"/>
+        <w:jc w:val="center"/>
+        <w:tblLook w:firstColumn="1" w:firstRow="1" w:lastColumn="0" w:lastRow="0" w:noHBand="0" w:noVBand="1" w:val="04A0"/>
+      </w:tblPr>
+      <w:tblGrid>
+        <w:gridCol w:w="10080"/>
+      </w:tblGrid>
+      <w:tr>
+        <w:tc>
+          <w:tcPr>
+            <w:tcW w:type="dxa" w:w="10080"/>
+            <w:shd w:fill="F2F6FA"/>
+          </w:tcPr>
+          <w:p>
+            <w:r>
+              <w:rPr>
+                <w:rFonts w:ascii="Aptos" w:hAnsi="Aptos"/>
+                <w:sz w:val="18"/>
+              </w:rPr>
+              <w:t>Design an outbound autossh tunnel through CGNAT. Bind reverse ports to VPS loopback, proxy selected HTTP services, create a restartable systemd unit, and leave the family VPN untouched.</w:t>
+            </w:r>
+          </w:p>
+        </w:tc>
+      </w:tr>
+    </w:tbl>
+    <w:p/>
+    <w:p>
+      <w:pPr>
+        <w:pStyle w:val="Heading2"/>
+      </w:pPr>
+      <w:r>
+        <w:t>Why this stage was needed</w:t>
+      </w:r>
+    </w:p>
+    <w:p>
+      <w:r>
+        <w:t>Kernel-level VPN experiments were risky on the legacy Tegra platform and could disrupt existing family VPN users.</w:t>
+      </w:r>
+    </w:p>
+    <w:p>
+      <w:pPr>
+        <w:pStyle w:val="Heading2"/>
+      </w:pPr>
+      <w:r>
+        <w:t>What was created</w:t>
+      </w:r>
+    </w:p>
+    <w:p>
+      <w:r>
+        <w:t>The reverse-tunnel ADR, systemd unit, loopback reverse ports, VPS proxy routes, and a ProxyCommand access runbook.</w:t>
+      </w:r>
+    </w:p>
+    <w:p>
+      <w:pPr>
+        <w:pStyle w:val="Heading2"/>
+      </w:pPr>
+      <w:r>
+        <w:t>Execution result</w:t>
+      </w:r>
+    </w:p>
+    <w:p>
+      <w:r>
+        <w:rPr>
+          <w:b/>
+        </w:rPr>
+        <w:t>The tunnel is active and enabled; management and service reverse ports listen only on VPS loopback, while selected public endpoints respond through the proxy.</w:t>
+      </w:r>
+    </w:p>
+    <w:p>
+      <w:pPr>
+        <w:pStyle w:val="Heading2"/>
+      </w:pPr>
+      <w:r>
+        <w:t>How to verify it</w:t>
+      </w:r>
+    </w:p>
+    <w:p>
+      <w:pPr>
+        <w:pStyle w:val="ListBullet"/>
+      </w:pPr>
+      <w:r>
+        <w:t>Check service state, VPS listening sockets, health endpoints, and management access through the established proxy path.</w:t>
+      </w:r>
+    </w:p>
+    <w:p>
+      <w:pPr>
+        <w:pStyle w:val="Heading2"/>
+      </w:pPr>
+      <w:r>
+        <w:t>Engineering lesson</w:t>
+      </w:r>
+    </w:p>
+    <w:p>
+      <w:r>
+        <w:t>Loopback binding is essential so a reverse port does not accidentally become a public service.</w:t>
+      </w:r>
+    </w:p>
+    <w:p>
+      <w:pPr>
+        <w:pStyle w:val="Heading2"/>
+      </w:pPr>
+      <w:r>
+        <w:t>Completion criterion</w:t>
+      </w:r>
+    </w:p>
+    <w:p>
+      <w:r>
+        <w:t>The stage is complete only when the result is reproducible from the repository, verification passes without disclosing sensitive data, rollback is clear, and remaining risks are recorded.</w:t>
+      </w:r>
+    </w:p>
+    <w:p>
+      <w:r>
+        <w:br w:type="page"/>
+      </w:r>
+    </w:p>
+    <w:p>
+      <w:pPr>
+        <w:pStyle w:val="Heading1"/>
+      </w:pPr>
+      <w:r>
+        <w:t>12. Add HTTPS for mobile clients</w:t>
+      </w:r>
+    </w:p>
+    <w:p>
+      <w:pPr>
+        <w:pStyle w:val="Heading2"/>
+      </w:pPr>
+      <w:r>
+        <w:t>Plan clarification — send separately</w:t>
+      </w:r>
+    </w:p>
+    <w:tbl>
+      <w:tblPr>
+        <w:tblW w:type="auto" w:w="0"/>
+        <w:jc w:val="center"/>
+        <w:tblLook w:firstColumn="1" w:firstRow="1" w:lastColumn="0" w:lastRow="0" w:noHBand="0" w:noVBand="1" w:val="04A0"/>
+      </w:tblPr>
+      <w:tblGrid>
+        <w:gridCol w:w="10080"/>
+      </w:tblGrid>
+      <w:tr>
+        <w:tc>
+          <w:tcPr>
+            <w:tcW w:type="dxa" w:w="10080"/>
+            <w:shd w:fill="F2F6FA"/>
+          </w:tcPr>
+          <w:p>
+            <w:r>
+              <w:rPr>
+                <w:rFonts w:ascii="Aptos" w:hAnsi="Aptos"/>
+                <w:sz w:val="18"/>
+              </w:rPr>
+              <w:t>Provide HTTPS at the VPS proxy. Treat a self-signed certificate as temporary, document trust distribution and SAN requirements, and define migration to a public CA when a domain is available.</w:t>
+            </w:r>
+          </w:p>
+        </w:tc>
+      </w:tr>
+    </w:tbl>
+    <w:p/>
+    <w:p>
+      <w:pPr>
+        <w:pStyle w:val="Heading2"/>
+      </w:pPr>
+      <w:r>
+        <w:t>Why this stage was needed</w:t>
+      </w:r>
+    </w:p>
+    <w:p>
+      <w:r>
+        <w:t>Mobile backup and DAV clients may restrict background operation over plain HTTP.</w:t>
+      </w:r>
+    </w:p>
+    <w:p>
+      <w:pPr>
+        <w:pStyle w:val="Heading2"/>
+      </w:pPr>
+      <w:r>
+        <w:t>What was created</w:t>
+      </w:r>
+    </w:p>
+    <w:p>
+      <w:r>
+        <w:t>HTTPS proxy configuration, certificate guidance, risk notes, and a migration plan.</w:t>
+      </w:r>
+    </w:p>
+    <w:p>
+      <w:pPr>
+        <w:pStyle w:val="Heading2"/>
+      </w:pPr>
+      <w:r>
+        <w:t>Execution result</w:t>
+      </w:r>
+    </w:p>
+    <w:p>
+      <w:r>
+        <w:rPr>
+          <w:b/>
+        </w:rPr>
+        <w:t>Mobile applications can use encrypted relayed access without exposing the home router.</w:t>
+      </w:r>
+    </w:p>
+    <w:p>
+      <w:pPr>
+        <w:pStyle w:val="Heading2"/>
+      </w:pPr>
+      <w:r>
+        <w:t>How to verify it</w:t>
+      </w:r>
+    </w:p>
+    <w:p>
+      <w:pPr>
+        <w:pStyle w:val="ListBullet"/>
+      </w:pPr>
+      <w:r>
+        <w:t>Inspect the certificate chain, SAN, expiry, and client trust behavior.</w:t>
+      </w:r>
+    </w:p>
+    <w:p>
+      <w:pPr>
+        <w:pStyle w:val="Heading2"/>
+      </w:pPr>
+      <w:r>
+        <w:t>Engineering lesson</w:t>
+      </w:r>
+    </w:p>
+    <w:p>
+      <w:r>
+        <w:t>Encryption and identity trust are separate properties.</w:t>
+      </w:r>
+    </w:p>
+    <w:p>
+      <w:pPr>
+        <w:pStyle w:val="Heading2"/>
+      </w:pPr>
+      <w:r>
+        <w:t>Completion criterion</w:t>
+      </w:r>
+    </w:p>
+    <w:p>
+      <w:r>
+        <w:t>The stage is complete only when the result is reproducible from the repository, verification passes without disclosing sensitive data, rollback is clear, and remaining risks are recorded.</w:t>
+      </w:r>
+    </w:p>
+    <w:p>
+      <w:r>
+        <w:br w:type="page"/>
+      </w:r>
+    </w:p>
+    <w:p>
+      <w:pPr>
+        <w:pStyle w:val="Heading1"/>
+      </w:pPr>
+      <w:r>
+        <w:t>13. Deploy lightweight monitoring</w:t>
+      </w:r>
+    </w:p>
+    <w:p>
+      <w:pPr>
+        <w:pStyle w:val="Heading2"/>
+      </w:pPr>
+      <w:r>
+        <w:t>Plan clarification — send separately</w:t>
+      </w:r>
+    </w:p>
+    <w:tbl>
+      <w:tblPr>
+        <w:tblW w:type="auto" w:w="0"/>
+        <w:jc w:val="center"/>
+        <w:tblLook w:firstColumn="1" w:firstRow="1" w:lastColumn="0" w:lastRow="0" w:noHBand="0" w:noVBand="1" w:val="04A0"/>
+      </w:tblPr>
+      <w:tblGrid>
+        <w:gridCol w:w="10080"/>
+      </w:tblGrid>
+      <w:tr>
+        <w:tc>
+          <w:tcPr>
+            <w:tcW w:type="dxa" w:w="10080"/>
+            <w:shd w:fill="F2F6FA"/>
+          </w:tcPr>
+          <w:p>
+            <w:r>
+              <w:rPr>
+                <w:rFonts w:ascii="Aptos" w:hAnsi="Aptos"/>
+                <w:sz w:val="18"/>
+              </w:rPr>
+              <w:t>Compare monitoring stacks for a 4 GB device, then deploy a lightweight combination of system metrics, uptime checks, and a management UI as an independent Compose block.</w:t>
+            </w:r>
+          </w:p>
+        </w:tc>
+      </w:tr>
+    </w:tbl>
+    <w:p/>
+    <w:p>
+      <w:pPr>
+        <w:pStyle w:val="Heading2"/>
+      </w:pPr>
+      <w:r>
+        <w:t>Why this stage was needed</w:t>
+      </w:r>
+    </w:p>
+    <w:p>
+      <w:r>
+        <w:t>A heavy monitoring database could consume a significant share of the resources it is meant to observe.</w:t>
+      </w:r>
+    </w:p>
+    <w:p>
+      <w:pPr>
+        <w:pStyle w:val="Heading2"/>
+      </w:pPr>
+      <w:r>
+        <w:t>What was created</w:t>
+      </w:r>
+    </w:p>
+    <w:p>
+      <w:r>
+        <w:t>Monitoring Compose definitions, dashboards, uptime checks, and an observability runbook.</w:t>
+      </w:r>
+    </w:p>
+    <w:p>
+      <w:pPr>
+        <w:pStyle w:val="Heading2"/>
+      </w:pPr>
+      <w:r>
+        <w:t>Execution result</w:t>
+      </w:r>
+    </w:p>
+    <w:p>
+      <w:r>
+        <w:rPr>
+          <w:b/>
+        </w:rPr>
+        <w:t>System metrics and uptime monitoring are live; the management UI runs without its own healthcheck.</w:t>
+      </w:r>
+    </w:p>
+    <w:p>
+      <w:pPr>
+        <w:pStyle w:val="Heading2"/>
+      </w:pPr>
+      <w:r>
+        <w:t>How to verify it</w:t>
+      </w:r>
+    </w:p>
+    <w:p>
+      <w:pPr>
+        <w:pStyle w:val="ListBullet"/>
+      </w:pPr>
+      <w:r>
+        <w:t>Check monitoring endpoints, container resource use, and free memory before and after deployment.</w:t>
+      </w:r>
+    </w:p>
+    <w:p>
+      <w:pPr>
+        <w:pStyle w:val="Heading2"/>
+      </w:pPr>
+      <w:r>
+        <w:t>Engineering lesson</w:t>
+      </w:r>
+    </w:p>
+    <w:p>
+      <w:r>
+        <w:t>Monitoring must remain cheaper than the workload it observes.</w:t>
+      </w:r>
+    </w:p>
+    <w:p>
+      <w:pPr>
+        <w:pStyle w:val="Heading2"/>
+      </w:pPr>
+      <w:r>
+        <w:t>Completion criterion</w:t>
+      </w:r>
+    </w:p>
+    <w:p>
+      <w:r>
+        <w:t>The stage is complete only when the result is reproducible from the repository, verification passes without disclosing sensitive data, rollback is clear, and remaining risks are recorded.</w:t>
+      </w:r>
+    </w:p>
+    <w:p>
+      <w:r>
+        <w:br w:type="page"/>
+      </w:r>
+    </w:p>
+    <w:p>
+      <w:pPr>
+        <w:pStyle w:val="Heading1"/>
+      </w:pPr>
+      <w:r>
+        <w:t>14. Generate daily reports and notifications</w:t>
+      </w:r>
+    </w:p>
+    <w:p>
+      <w:pPr>
+        <w:pStyle w:val="Heading2"/>
+      </w:pPr>
+      <w:r>
+        <w:t>Plan clarification — send separately</w:t>
+      </w:r>
+    </w:p>
+    <w:tbl>
+      <w:tblPr>
+        <w:tblW w:type="auto" w:w="0"/>
+        <w:jc w:val="center"/>
+        <w:tblLook w:firstColumn="1" w:firstRow="1" w:lastColumn="0" w:lastRow="0" w:noHBand="0" w:noVBand="1" w:val="04A0"/>
+      </w:tblPr>
+      <w:tblGrid>
+        <w:gridCol w:w="10080"/>
+      </w:tblGrid>
+      <w:tr>
+        <w:tc>
+          <w:tcPr>
+            <w:tcW w:type="dxa" w:w="10080"/>
+            <w:shd w:fill="F2F6FA"/>
+          </w:tcPr>
+          <w:p>
+            <w:r>
+              <w:rPr>
+                <w:rFonts w:ascii="Aptos" w:hAnsi="Aptos"/>
+                <w:sz w:val="18"/>
+              </w:rPr>
+              <w:t>Create a daily health summary for uptime, memory, storage, containers, endpoints, tunnel, and backup. Separate report generation from delivery and keep notification credentials outside logs and Git.</w:t>
+            </w:r>
+          </w:p>
+        </w:tc>
+      </w:tr>
+    </w:tbl>
+    <w:p/>
+    <w:p>
+      <w:pPr>
+        <w:pStyle w:val="Heading2"/>
+      </w:pPr>
+      <w:r>
+        <w:t>Why this stage was needed</w:t>
+      </w:r>
+    </w:p>
+    <w:p>
+      <w:r>
+        <w:t>A short daily summary exposes degradation faster than manually opening several dashboards.</w:t>
+      </w:r>
+    </w:p>
+    <w:p>
+      <w:pPr>
+        <w:pStyle w:val="Heading2"/>
+      </w:pPr>
+      <w:r>
+        <w:t>What was created</w:t>
+      </w:r>
+    </w:p>
+    <w:p>
+      <w:r>
+        <w:t>Reporting scripts, a notification sender, and a systemd oneshot service and persistent timer.</w:t>
+      </w:r>
+    </w:p>
+    <w:p>
+      <w:pPr>
+        <w:pStyle w:val="Heading2"/>
+      </w:pPr>
+      <w:r>
+        <w:t>Execution result</w:t>
+      </w:r>
+    </w:p>
+    <w:p>
+      <w:r>
+        <w:rPr>
+          <w:b/>
+        </w:rPr>
+        <w:t>Daily reporting works; an invalid restart policy for a oneshot service was identified and corrected.</w:t>
+      </w:r>
+    </w:p>
+    <w:p>
+      <w:pPr>
+        <w:pStyle w:val="Heading2"/>
+      </w:pPr>
+      <w:r>
+        <w:t>How to verify it</w:t>
+      </w:r>
+    </w:p>
+    <w:p>
+      <w:pPr>
+        <w:pStyle w:val="ListBullet"/>
+      </w:pPr>
+      <w:r>
+        <w:t>Validate the unit, execute a dry run, inspect its journal, and check the timer schedule without printing credentials.</w:t>
+      </w:r>
+    </w:p>
+    <w:p>
+      <w:pPr>
+        <w:pStyle w:val="Heading2"/>
+      </w:pPr>
+      <w:r>
+        <w:t>Engineering lesson</w:t>
+      </w:r>
+    </w:p>
+    <w:p>
+      <w:r>
+        <w:t>Enabling a persistent timer may immediately run a missed job.</w:t>
+      </w:r>
+    </w:p>
+    <w:p>
+      <w:pPr>
+        <w:pStyle w:val="Heading2"/>
+      </w:pPr>
+      <w:r>
+        <w:t>Completion criterion</w:t>
+      </w:r>
+    </w:p>
+    <w:p>
+      <w:r>
+        <w:t>The stage is complete only when the result is reproducible from the repository, verification passes without disclosing sensitive data, rollback is clear, and remaining risks are recorded.</w:t>
+      </w:r>
+    </w:p>
+    <w:p>
+      <w:r>
+        <w:br w:type="page"/>
+      </w:r>
+    </w:p>
+    <w:p>
+      <w:pPr>
+        <w:pStyle w:val="Heading1"/>
+      </w:pPr>
+      <w:r>
+        <w:t>15. Build the NASA automation API</w:t>
+      </w:r>
+    </w:p>
+    <w:p>
+      <w:pPr>
+        <w:pStyle w:val="Heading2"/>
+      </w:pPr>
+      <w:r>
+        <w:t>Plan clarification — send separately</w:t>
+      </w:r>
+    </w:p>
+    <w:tbl>
+      <w:tblPr>
+        <w:tblW w:type="auto" w:w="0"/>
+        <w:jc w:val="center"/>
+        <w:tblLook w:firstColumn="1" w:firstRow="1" w:lastColumn="0" w:lastRow="0" w:noHBand="0" w:noVBand="1" w:val="04A0"/>
+      </w:tblPr>
+      <w:tblGrid>
+        <w:gridCol w:w="10080"/>
+      </w:tblGrid>
+      <w:tr>
+        <w:tc>
+          <w:tcPr>
+            <w:tcW w:type="dxa" w:w="10080"/>
+            <w:shd w:fill="F2F6FA"/>
+          </w:tcPr>
+          <w:p>
+            <w:r>
+              <w:rPr>
+                <w:rFonts w:ascii="Aptos" w:hAnsi="Aptos"/>
+                <w:sz w:val="18"/>
+              </w:rPr>
+              <w:t>Create an authenticated FastAPI layer for health, system, storage, containers, application statistics, reports, and allowlisted administrative actions. Document it through OpenAPI.</w:t>
+            </w:r>
+          </w:p>
+        </w:tc>
+      </w:tr>
+    </w:tbl>
+    <w:p/>
+    <w:p>
+      <w:pPr>
+        <w:pStyle w:val="Heading2"/>
+      </w:pPr>
+      <w:r>
+        <w:t>Why this stage was needed</w:t>
+      </w:r>
+    </w:p>
+    <w:p>
+      <w:r>
+        <w:t>A browser management UI is unsuitable for scripts, scheduled tasks, mobile clients, and integrations.</w:t>
+      </w:r>
+    </w:p>
+    <w:p>
+      <w:pPr>
+        <w:pStyle w:val="Heading2"/>
+      </w:pPr>
+      <w:r>
+        <w:t>What was created</w:t>
+      </w:r>
+    </w:p>
+    <w:p>
+      <w:r>
+        <w:t>NASA API service, schemas, JWT middleware, audit controls, OpenAPI, tests, and Compose integration.</w:t>
+      </w:r>
+    </w:p>
+    <w:p>
+      <w:pPr>
+        <w:pStyle w:val="Heading2"/>
+      </w:pPr>
+      <w:r>
+        <w:t>Execution result</w:t>
+      </w:r>
+    </w:p>
+    <w:p>
+      <w:r>
+        <w:rPr>
+          <w:b/>
+        </w:rPr>
+        <w:t>The API is healthy and its live OpenAPI description contains the expected paths and operations.</w:t>
+      </w:r>
+    </w:p>
+    <w:p>
+      <w:pPr>
+        <w:pStyle w:val="Heading2"/>
+      </w:pPr>
+      <w:r>
+        <w:t>How to verify it</w:t>
+      </w:r>
+    </w:p>
+    <w:p>
+      <w:pPr>
+        <w:pStyle w:val="ListBullet"/>
+      </w:pPr>
+      <w:r>
+        <w:t>Check the health endpoint, count OpenAPI paths and operations, run tests, and confirm protected calls fail without authorization.</w:t>
+      </w:r>
+    </w:p>
+    <w:p>
+      <w:pPr>
+        <w:pStyle w:val="Heading2"/>
+      </w:pPr>
+      <w:r>
+        <w:t>Engineering lesson</w:t>
+      </w:r>
+    </w:p>
+    <w:p>
+      <w:r>
+        <w:t>Endpoint counts should come from OpenAPI rather than assumptions about functions or modules.</w:t>
+      </w:r>
+    </w:p>
+    <w:p>
+      <w:pPr>
+        <w:pStyle w:val="Heading2"/>
+      </w:pPr>
+      <w:r>
+        <w:t>Completion criterion</w:t>
+      </w:r>
+    </w:p>
+    <w:p>
+      <w:r>
+        <w:t>The stage is complete only when the result is reproducible from the repository, verification passes without disclosing sensitive data, rollback is clear, and remaining risks are recorded.</w:t>
+      </w:r>
+    </w:p>
+    <w:p>
+      <w:r>
+        <w:br w:type="page"/>
+      </w:r>
+    </w:p>
+    <w:p>
+      <w:pPr>
+        <w:pStyle w:val="Heading1"/>
+      </w:pPr>
+      <w:r>
+        <w:t>16. Automate infrastructure validation</w:t>
+      </w:r>
+    </w:p>
+    <w:p>
+      <w:pPr>
+        <w:pStyle w:val="Heading2"/>
+      </w:pPr>
+      <w:r>
+        <w:t>Plan clarification — send separately</w:t>
+      </w:r>
+    </w:p>
+    <w:tbl>
+      <w:tblPr>
+        <w:tblW w:type="auto" w:w="0"/>
+        <w:jc w:val="center"/>
+        <w:tblLook w:firstColumn="1" w:firstRow="1" w:lastColumn="0" w:lastRow="0" w:noHBand="0" w:noVBand="1" w:val="04A0"/>
+      </w:tblPr>
+      <w:tblGrid>
+        <w:gridCol w:w="10080"/>
+      </w:tblGrid>
+      <w:tr>
+        <w:tc>
+          <w:tcPr>
+            <w:tcW w:type="dxa" w:w="10080"/>
+            <w:shd w:fill="F2F6FA"/>
+          </w:tcPr>
+          <w:p>
+            <w:r>
+              <w:rPr>
+                <w:rFonts w:ascii="Aptos" w:hAnsi="Aptos"/>
+                <w:sz w:val="18"/>
+              </w:rPr>
+              <w:t>Create read-only checks for files, systemd units, ports, containers, HTTP endpoints, storage mounts, and absence of public SMB. Separate safe smoke tests from destructive tests.</w:t>
+            </w:r>
+          </w:p>
+        </w:tc>
+      </w:tr>
+    </w:tbl>
+    <w:p/>
+    <w:p>
+      <w:pPr>
+        <w:pStyle w:val="Heading2"/>
+      </w:pPr>
+      <w:r>
+        <w:t>Why this stage was needed</w:t>
+      </w:r>
+    </w:p>
+    <w:p>
+      <w:r>
+        <w:t>Manual verification becomes incomplete as the number of components grows.</w:t>
+      </w:r>
+    </w:p>
+    <w:p>
+      <w:pPr>
+        <w:pStyle w:val="Heading2"/>
+      </w:pPr>
+      <w:r>
+        <w:t>What was created</w:t>
+      </w:r>
+    </w:p>
+    <w:p>
+      <w:r>
+        <w:t>Goss and script-based checks, acceptance checklists, and evidence-report templates.</w:t>
+      </w:r>
+    </w:p>
+    <w:p>
+      <w:pPr>
+        <w:pStyle w:val="Heading2"/>
+      </w:pPr>
+      <w:r>
+        <w:t>Execution result</w:t>
+      </w:r>
+    </w:p>
+    <w:p>
+      <w:r>
+        <w:rPr>
+          <w:b/>
+        </w:rPr>
+        <w:t>The historical suite reached a full pass; current release work still requires a dated rerun before publication.</w:t>
+      </w:r>
+    </w:p>
+    <w:p>
+      <w:pPr>
+        <w:pStyle w:val="Heading2"/>
+      </w:pPr>
+      <w:r>
+        <w:t>How to verify it</w:t>
+      </w:r>
+    </w:p>
+    <w:p>
+      <w:pPr>
+        <w:pStyle w:val="ListBullet"/>
+      </w:pPr>
+      <w:r>
+        <w:t>Run the validation suite, inspect exit codes, and save only sanitized aggregate evidence.</w:t>
+      </w:r>
+    </w:p>
+    <w:p>
+      <w:pPr>
+        <w:pStyle w:val="Heading2"/>
+      </w:pPr>
+      <w:r>
+        <w:t>Engineering lesson</w:t>
+      </w:r>
+    </w:p>
+    <w:p>
+      <w:r>
+        <w:t>An old passing test result is not evidence of current state unless it is dated and repeated.</w:t>
+      </w:r>
+    </w:p>
+    <w:p>
+      <w:pPr>
+        <w:pStyle w:val="Heading2"/>
+      </w:pPr>
+      <w:r>
+        <w:t>Completion criterion</w:t>
+      </w:r>
+    </w:p>
+    <w:p>
+      <w:r>
+        <w:t>The stage is complete only when the result is reproducible from the repository, verification passes without disclosing sensitive data, rollback is clear, and remaining risks are recorded.</w:t>
+      </w:r>
+    </w:p>
+    <w:p>
+      <w:r>
+        <w:br w:type="page"/>
+      </w:r>
+    </w:p>
+    <w:p>
+      <w:pPr>
+        <w:pStyle w:val="Heading1"/>
+      </w:pPr>
+      <w:r>
+        <w:t>17. Implement backup and restore preparation</w:t>
+      </w:r>
+    </w:p>
+    <w:p>
+      <w:pPr>
+        <w:pStyle w:val="Heading2"/>
+      </w:pPr>
+      <w:r>
+        <w:t>Plan clarification — send separately</w:t>
+      </w:r>
+    </w:p>
+    <w:tbl>
+      <w:tblPr>
+        <w:tblW w:type="auto" w:w="0"/>
+        <w:jc w:val="center"/>
+        <w:tblLook w:firstColumn="1" w:firstRow="1" w:lastColumn="0" w:lastRow="0" w:noHBand="0" w:noVBand="1" w:val="04A0"/>
+      </w:tblPr>
+      <w:tblGrid>
+        <w:gridCol w:w="10080"/>
+      </w:tblGrid>
+      <w:tr>
+        <w:tc>
+          <w:tcPr>
+            <w:tcW w:type="dxa" w:w="10080"/>
+            <w:shd w:fill="F2F6FA"/>
+          </w:tcPr>
+          <w:p>
+            <w:r>
+              <w:rPr>
+                <w:rFonts w:ascii="Aptos" w:hAnsi="Aptos"/>
+                <w:sz w:val="18"/>
+              </w:rPr>
+              <w:t>Create database dumps for core applications with storage preflight, atomic temporary files, retention, and documented restore procedures. Do not execute restore without separate approval.</w:t>
+            </w:r>
+          </w:p>
+        </w:tc>
+      </w:tr>
+    </w:tbl>
+    <w:p/>
+    <w:p>
+      <w:pPr>
+        <w:pStyle w:val="Heading2"/>
+      </w:pPr>
+      <w:r>
+        <w:t>Why this stage was needed</w:t>
+      </w:r>
+    </w:p>
+    <w:p>
+      <w:r>
+        <w:t>Docker volumes are not backups, and a copy on the same SSD does not protect against media failure.</w:t>
+      </w:r>
+    </w:p>
+    <w:p>
+      <w:pPr>
+        <w:pStyle w:val="Heading2"/>
+      </w:pPr>
+      <w:r>
+        <w:t>What was created</w:t>
+      </w:r>
+    </w:p>
+    <w:p>
+      <w:r>
+        <w:t>Database dump scripts, systemd scheduling, retention, storage guards, and restore documentation.</w:t>
+      </w:r>
+    </w:p>
+    <w:p>
+      <w:pPr>
+        <w:pStyle w:val="Heading2"/>
+      </w:pPr>
+      <w:r>
+        <w:t>Execution result</w:t>
+      </w:r>
+    </w:p>
+    <w:p>
+      <w:r>
+        <w:rPr>
+          <w:b/>
+        </w:rPr>
+        <w:t>Database dumps are produced successfully; independent off-site backup remains a separate future stage.</w:t>
+      </w:r>
+    </w:p>
+    <w:p>
+      <w:pPr>
+        <w:pStyle w:val="Heading2"/>
+      </w:pPr>
+      <w:r>
+        <w:t>How to verify it</w:t>
+      </w:r>
+    </w:p>
+    <w:p>
+      <w:pPr>
+        <w:pStyle w:val="ListBullet"/>
+      </w:pPr>
+      <w:r>
+        <w:t>Check service logs, dump freshness and size, and perform restore drills only into an isolated test database.</w:t>
+      </w:r>
+    </w:p>
+    <w:p>
+      <w:pPr>
+        <w:pStyle w:val="Heading2"/>
+      </w:pPr>
+      <w:r>
+        <w:t>Engineering lesson</w:t>
+      </w:r>
+    </w:p>
+    <w:p>
+      <w:r>
+        <w:t>A dump file is useful only after recoverability has been tested.</w:t>
+      </w:r>
+    </w:p>
+    <w:p>
+      <w:pPr>
+        <w:pStyle w:val="Heading2"/>
+      </w:pPr>
+      <w:r>
+        <w:t>Completion criterion</w:t>
+      </w:r>
+    </w:p>
+    <w:p>
+      <w:r>
+        <w:t>The stage is complete only when the result is reproducible from the repository, verification passes without disclosing sensitive data, rollback is clear, and remaining risks are recorded.</w:t>
+      </w:r>
+    </w:p>
+    <w:p>
+      <w:r>
+        <w:br w:type="page"/>
+      </w:r>
+    </w:p>
+    <w:p>
+      <w:pPr>
+        <w:pStyle w:val="Heading1"/>
+      </w:pPr>
+      <w:r>
+        <w:t>18. Investigate USB storage incidents</w:t>
+      </w:r>
+    </w:p>
+    <w:p>
+      <w:pPr>
+        <w:pStyle w:val="Heading2"/>
+      </w:pPr>
+      <w:r>
+        <w:t>Plan clarification — send separately</w:t>
+      </w:r>
+    </w:p>
+    <w:tbl>
+      <w:tblPr>
+        <w:tblW w:type="auto" w:w="0"/>
+        <w:jc w:val="center"/>
+        <w:tblLook w:firstColumn="1" w:firstRow="1" w:lastColumn="0" w:lastRow="0" w:noHBand="0" w:noVBand="1" w:val="04A0"/>
+      </w:tblPr>
+      <w:tblGrid>
+        <w:gridCol w:w="10080"/>
+      </w:tblGrid>
+      <w:tr>
+        <w:tc>
+          <w:tcPr>
+            <w:tcW w:type="dxa" w:w="10080"/>
+            <w:shd w:fill="F2F6FA"/>
+          </w:tcPr>
+          <w:p>
+            <w:r>
+              <w:rPr>
+                <w:rFonts w:ascii="Aptos" w:hAnsi="Aptos"/>
+                <w:sz w:val="18"/>
+              </w:rPr>
+              <w:t>Perform a read-only investigation of USB resets, throughput degradation, and filesystem errors. Correlate bridge chipset, USB mode, physical port, kernel messages, and mount behavior before proposing changes.</w:t>
+            </w:r>
+          </w:p>
+        </w:tc>
+      </w:tr>
+    </w:tbl>
+    <w:p/>
+    <w:p>
+      <w:pPr>
+        <w:pStyle w:val="Heading2"/>
+      </w:pPr>
+      <w:r>
+        <w:t>Why this stage was needed</w:t>
+      </w:r>
+    </w:p>
+    <w:p>
+      <w:r>
+        <w:t>Power-management tweaks alone could not explain repeated storage failures.</w:t>
+      </w:r>
+    </w:p>
+    <w:p>
+      <w:pPr>
+        <w:pStyle w:val="Heading2"/>
+      </w:pPr>
+      <w:r>
+        <w:t>What was created</w:t>
+      </w:r>
+    </w:p>
+    <w:p>
+      <w:r>
+        <w:t>Incident reports, storage-health scripts, recovery services, hotplug handling, and guarded watchdog logic.</w:t>
+      </w:r>
+    </w:p>
+    <w:p>
+      <w:pPr>
+        <w:pStyle w:val="Heading2"/>
+      </w:pPr>
+      <w:r>
+        <w:t>Execution result</w:t>
+      </w:r>
+    </w:p>
+    <w:p>
+      <w:r>
+        <w:rPr>
+          <w:b/>
+        </w:rPr>
+        <w:t>The unstable bridge was replaced with a JMS583 device; storage recovery and reboot behavior were validated, with historical throughput measurements retained as dated evidence.</w:t>
+      </w:r>
+    </w:p>
+    <w:p>
+      <w:pPr>
+        <w:pStyle w:val="Heading2"/>
+      </w:pPr>
+      <w:r>
+        <w:t>How to verify it</w:t>
+      </w:r>
+    </w:p>
+    <w:p>
+      <w:pPr>
+        <w:pStyle w:val="ListBullet"/>
+      </w:pPr>
+      <w:r>
+        <w:t>Check USB identity and topology, new kernel messages, mounts, preflight, and controlled reboot acceptance. Benchmark only with approval.</w:t>
+      </w:r>
+    </w:p>
+    <w:p>
+      <w:pPr>
+        <w:pStyle w:val="Heading2"/>
+      </w:pPr>
+      <w:r>
+        <w:t>Engineering lesson</w:t>
+      </w:r>
+    </w:p>
+    <w:p>
+      <w:r>
+        <w:t>Automation should not repeatedly reset hardware before the physical failure mode is understood.</w:t>
+      </w:r>
+    </w:p>
+    <w:p>
+      <w:pPr>
+        <w:pStyle w:val="Heading2"/>
+      </w:pPr>
+      <w:r>
+        <w:t>Completion criterion</w:t>
+      </w:r>
+    </w:p>
+    <w:p>
+      <w:r>
+        <w:t>The stage is complete only when the result is reproducible from the repository, verification passes without disclosing sensitive data, rollback is clear, and remaining risks are recorded.</w:t>
+      </w:r>
+    </w:p>
+    <w:p>
+      <w:r>
+        <w:br w:type="page"/>
+      </w:r>
+    </w:p>
+    <w:p>
+      <w:pPr>
+        <w:pStyle w:val="Heading1"/>
+      </w:pPr>
+      <w:r>
+        <w:t>19. Audit security and privacy</w:t>
+      </w:r>
+    </w:p>
+    <w:p>
+      <w:pPr>
+        <w:pStyle w:val="Heading2"/>
+      </w:pPr>
+      <w:r>
+        <w:t>Plan clarification — send separately</w:t>
+      </w:r>
+    </w:p>
+    <w:tbl>
+      <w:tblPr>
+        <w:tblW w:type="auto" w:w="0"/>
+        <w:jc w:val="center"/>
+        <w:tblLook w:firstColumn="1" w:firstRow="1" w:lastColumn="0" w:lastRow="0" w:noHBand="0" w:noVBand="1" w:val="04A0"/>
+      </w:tblPr>
+      <w:tblGrid>
+        <w:gridCol w:w="10080"/>
+      </w:tblGrid>
+      <w:tr>
+        <w:tc>
+          <w:tcPr>
+            <w:tcW w:type="dxa" w:w="10080"/>
+            <w:shd w:fill="F2F6FA"/>
+          </w:tcPr>
+          <w:p>
+            <w:r>
+              <w:rPr>
+                <w:rFonts w:ascii="Aptos" w:hAnsi="Aptos"/>
+                <w:sz w:val="18"/>
+              </w:rPr>
+              <w:t>Review ignored and tracked files, Git history, environment references, network exposure, reverse-port binding, screenshots, and documentation. Report locations and types without printing discovered secrets.</w:t>
+            </w:r>
+          </w:p>
+        </w:tc>
+      </w:tr>
+    </w:tbl>
+    <w:p/>
+    <w:p>
+      <w:pPr>
+        <w:pStyle w:val="Heading2"/>
+      </w:pPr>
+      <w:r>
+        <w:t>Why this stage was needed</w:t>
+      </w:r>
+    </w:p>
+    <w:p>
+      <w:r>
+        <w:t>The project combines public source code, private family data, a home network, and an external VPS.</w:t>
+      </w:r>
+    </w:p>
+    <w:p>
+      <w:pPr>
+        <w:pStyle w:val="Heading2"/>
+      </w:pPr>
+      <w:r>
+        <w:t>What was created</w:t>
+      </w:r>
+    </w:p>
+    <w:p>
+      <w:r>
+        <w:t>Security documentation, secret scanning, publication redaction checklists, privacy-safe assets, and external-LLM restrictions.</w:t>
+      </w:r>
+    </w:p>
+    <w:p>
+      <w:pPr>
+        <w:pStyle w:val="Heading2"/>
+      </w:pPr>
+      <w:r>
+        <w:t>Execution result</w:t>
+      </w:r>
+    </w:p>
+    <w:p>
+      <w:r>
+        <w:rPr>
+          <w:b/>
+        </w:rPr>
+        <w:t>Published artifacts use placeholders and sanitized metadata; reverse ports are loopback-only. A full shell-based secret check must still be rerun in a working Unix environment before release.</w:t>
+      </w:r>
+    </w:p>
+    <w:p>
+      <w:pPr>
+        <w:pStyle w:val="Heading2"/>
+      </w:pPr>
+      <w:r>
+        <w:t>How to verify it</w:t>
+      </w:r>
+    </w:p>
+    <w:p>
+      <w:pPr>
+        <w:pStyle w:val="ListBullet"/>
+      </w:pPr>
+      <w:r>
+        <w:t>Run secret scanning, diff checks, image review, and scoped network exposure checks.</w:t>
+      </w:r>
+    </w:p>
+    <w:p>
+      <w:pPr>
+        <w:pStyle w:val="Heading2"/>
+      </w:pPr>
+      <w:r>
+        <w:t>Engineering lesson</w:t>
+      </w:r>
+    </w:p>
+    <w:p>
+      <w:r>
+        <w:t>Removing a secret from the current file does not remove it from Git history.</w:t>
+      </w:r>
+    </w:p>
+    <w:p>
+      <w:pPr>
+        <w:pStyle w:val="Heading2"/>
+      </w:pPr>
+      <w:r>
+        <w:t>Completion criterion</w:t>
+      </w:r>
+    </w:p>
+    <w:p>
+      <w:r>
+        <w:t>The stage is complete only when the result is reproducible from the repository, verification passes without disclosing sensitive data, rollback is clear, and remaining risks are recorded.</w:t>
+      </w:r>
+    </w:p>
+    <w:p>
+      <w:r>
+        <w:br w:type="page"/>
+      </w:r>
+    </w:p>
+    <w:p>
+      <w:pPr>
+        <w:pStyle w:val="Heading1"/>
+      </w:pPr>
+      <w:r>
+        <w:t>20. Prepare the article and its evidence</w:t>
+      </w:r>
+    </w:p>
+    <w:p>
+      <w:pPr>
+        <w:pStyle w:val="Heading2"/>
+      </w:pPr>
+      <w:r>
+        <w:t>Plan clarification — send separately</w:t>
+      </w:r>
+    </w:p>
+    <w:tbl>
+      <w:tblPr>
+        <w:tblW w:type="auto" w:w="0"/>
+        <w:jc w:val="center"/>
+        <w:tblLook w:firstColumn="1" w:firstRow="1" w:lastColumn="0" w:lastRow="0" w:noHBand="0" w:noVBand="1" w:val="04A0"/>
+      </w:tblPr>
+      <w:tblGrid>
+        <w:gridCol w:w="10080"/>
+      </w:tblGrid>
+      <w:tr>
+        <w:tc>
+          <w:tcPr>
+            <w:tcW w:type="dxa" w:w="10080"/>
+            <w:shd w:fill="F2F6FA"/>
+          </w:tcPr>
+          <w:p>
+            <w:r>
+              <w:rPr>
+                <w:rFonts w:ascii="Aptos" w:hAnsi="Aptos"/>
+                <w:sz w:val="18"/>
+              </w:rPr>
+              <w:t>Create a technical article where every numeric claim has a dated source and status. Use only redacted images and maintain canonical Markdown, publication variants, HTML, and DOCX outputs.</w:t>
+            </w:r>
+          </w:p>
+        </w:tc>
+      </w:tr>
+    </w:tbl>
+    <w:p/>
+    <w:p>
+      <w:pPr>
+        <w:pStyle w:val="Heading2"/>
+      </w:pPr>
+      <w:r>
+        <w:t>Why this stage was needed</w:t>
+      </w:r>
+    </w:p>
+    <w:p>
+      <w:r>
+        <w:t>Infrastructure metrics become stale quickly and historical screenshots can be mistaken for current measurements.</w:t>
+      </w:r>
+    </w:p>
+    <w:p>
+      <w:pPr>
+        <w:pStyle w:val="Heading2"/>
+      </w:pPr>
+      <w:r>
+        <w:t>What was created</w:t>
+      </w:r>
+    </w:p>
+    <w:p>
+      <w:r>
+        <w:t>Article variants, sanitized images, checklists, evidence reports, a facts table, and downloadable documents.</w:t>
+      </w:r>
+    </w:p>
+    <w:p>
+      <w:pPr>
+        <w:pStyle w:val="Heading2"/>
+      </w:pPr>
+      <w:r>
+        <w:t>Execution result</w:t>
+      </w:r>
+    </w:p>
+    <w:p>
+      <w:r>
+        <w:rPr>
+          <w:b/>
+        </w:rPr>
+        <w:t>The article was published and later updated with current infrastructure facts while preserving screenshots as historical evidence.</w:t>
+      </w:r>
+    </w:p>
+    <w:p>
+      <w:pPr>
+        <w:pStyle w:val="Heading2"/>
+      </w:pPr>
+      <w:r>
+        <w:t>How to verify it</w:t>
+      </w:r>
+    </w:p>
+    <w:p>
+      <w:pPr>
+        <w:pStyle w:val="ListBullet"/>
+      </w:pPr>
+      <w:r>
+        <w:t>Check image references, HTML rendering, DOCX structure, facts-table consistency, and the published pages.</w:t>
+      </w:r>
+    </w:p>
+    <w:p>
+      <w:pPr>
+        <w:pStyle w:val="Heading2"/>
+      </w:pPr>
+      <w:r>
+        <w:t>Engineering lesson</w:t>
+      </w:r>
+    </w:p>
+    <w:p>
+      <w:r>
+        <w:t>Updating an article should distinguish current facts from historical evidence rather than erase history.</w:t>
+      </w:r>
+    </w:p>
+    <w:p>
+      <w:pPr>
+        <w:pStyle w:val="Heading2"/>
+      </w:pPr>
+      <w:r>
+        <w:t>Completion criterion</w:t>
+      </w:r>
+    </w:p>
+    <w:p>
+      <w:r>
+        <w:t>The stage is complete only when the result is reproducible from the repository, verification passes without disclosing sensitive data, rollback is clear, and remaining risks are recorded.</w:t>
+      </w:r>
+    </w:p>
+    <w:p>
+      <w:r>
+        <w:br w:type="page"/>
+      </w:r>
+    </w:p>
+    <w:p>
+      <w:pPr>
+        <w:pStyle w:val="Heading1"/>
+      </w:pPr>
+      <w:r>
+        <w:t>21. Run a live reliability audit</w:t>
+      </w:r>
+    </w:p>
+    <w:p>
+      <w:pPr>
+        <w:pStyle w:val="Heading2"/>
+      </w:pPr>
+      <w:r>
+        <w:t>Plan clarification — send separately</w:t>
+      </w:r>
+    </w:p>
+    <w:tbl>
+      <w:tblPr>
+        <w:tblW w:type="auto" w:w="0"/>
+        <w:jc w:val="center"/>
+        <w:tblLook w:firstColumn="1" w:firstRow="1" w:lastColumn="0" w:lastRow="0" w:noHBand="0" w:noVBand="1" w:val="04A0"/>
+      </w:tblPr>
+      <w:tblGrid>
+        <w:gridCol w:w="10080"/>
+      </w:tblGrid>
+      <w:tr>
+        <w:tc>
+          <w:tcPr>
+            <w:tcW w:type="dxa" w:w="10080"/>
+            <w:shd w:fill="F2F6FA"/>
+          </w:tcPr>
+          <w:p>
+            <w:r>
+              <w:rPr>
+                <w:rFonts w:ascii="Aptos" w:hAnsi="Aptos"/>
+                <w:sz w:val="18"/>
+              </w:rPr>
+              <w:t>Verify VPS and Jetson through the existing reverse tunnel. Check uptime, mount state, preflight, containers, failed units, tunnel, and local/public endpoints. Reboot only with explicit approval.</w:t>
+            </w:r>
+          </w:p>
+        </w:tc>
+      </w:tr>
+    </w:tbl>
+    <w:p/>
+    <w:p>
+      <w:pPr>
+        <w:pStyle w:val="Heading2"/>
+      </w:pPr>
+      <w:r>
+        <w:t>Why this stage was needed</w:t>
+      </w:r>
+    </w:p>
+    <w:p>
+      <w:r>
+        <w:t>A system running before reboot does not prove correct startup order or automatic recovery.</w:t>
+      </w:r>
+    </w:p>
+    <w:p>
+      <w:pPr>
+        <w:pStyle w:val="Heading2"/>
+      </w:pPr>
+      <w:r>
+        <w:t>What was created</w:t>
+      </w:r>
+    </w:p>
+    <w:p>
+      <w:r>
+        <w:t>Reliability plan, reboot checklist, operational evidence, and incident checkpoints.</w:t>
+      </w:r>
+    </w:p>
+    <w:p>
+      <w:pPr>
+        <w:pStyle w:val="Heading2"/>
+      </w:pPr>
+      <w:r>
+        <w:t>Execution result</w:t>
+      </w:r>
+    </w:p>
+    <w:p>
+      <w:r>
+        <w:rPr>
+          <w:b/>
+        </w:rPr>
+        <w:t>Controlled reboot testing previously confirmed automatic recovery. A later read-only audit confirmed the core stack and reported one failed storage-monitoring unit as an open degradation.</w:t>
+      </w:r>
+    </w:p>
+    <w:p>
+      <w:pPr>
+        <w:pStyle w:val="Heading2"/>
+      </w:pPr>
+      <w:r>
+        <w:t>How to verify it</w:t>
+      </w:r>
+    </w:p>
+    <w:p>
+      <w:pPr>
+        <w:pStyle w:val="ListBullet"/>
+      </w:pPr>
+      <w:r>
+        <w:t>Use the existing safe access path, verify mounts, containers, failed units, and endpoints, and compare boot identity only during an approved reboot test.</w:t>
+      </w:r>
+    </w:p>
+    <w:p>
+      <w:pPr>
+        <w:pStyle w:val="Heading2"/>
+      </w:pPr>
+      <w:r>
+        <w:t>Engineering lesson</w:t>
+      </w:r>
+    </w:p>
+    <w:p>
+      <w:r>
+        <w:t>Reliability reports must disclose degradation instead of hiding it behind an overall success statement.</w:t>
+      </w:r>
+    </w:p>
+    <w:p>
+      <w:pPr>
+        <w:pStyle w:val="Heading2"/>
+      </w:pPr>
+      <w:r>
+        <w:t>Completion criterion</w:t>
+      </w:r>
+    </w:p>
+    <w:p>
+      <w:r>
+        <w:t>The stage is complete only when the result is reproducible from the repository, verification passes without disclosing sensitive data, rollback is clear, and remaining risks are recorded.</w:t>
+      </w:r>
+    </w:p>
+    <w:p>
+      <w:r>
+        <w:br w:type="page"/>
+      </w:r>
+    </w:p>
+    <w:p>
+      <w:pPr>
+        <w:pStyle w:val="Heading1"/>
+      </w:pPr>
+      <w:r>
+        <w:t>22. Plan an open-router migration</w:t>
+      </w:r>
+    </w:p>
+    <w:p>
+      <w:pPr>
+        <w:pStyle w:val="Heading2"/>
+      </w:pPr>
+      <w:r>
+        <w:t>Plan clarification — send separately</w:t>
+      </w:r>
+    </w:p>
+    <w:tbl>
+      <w:tblPr>
+        <w:tblW w:type="auto" w:w="0"/>
+        <w:jc w:val="center"/>
+        <w:tblLook w:firstColumn="1" w:firstRow="1" w:lastColumn="0" w:lastRow="0" w:noHBand="0" w:noVBand="1" w:val="04A0"/>
+      </w:tblPr>
+      <w:tblGrid>
+        <w:gridCol w:w="10080"/>
+      </w:tblGrid>
+      <w:tr>
+        <w:tc>
+          <w:tcPr>
+            <w:tcW w:type="dxa" w:w="10080"/>
+            <w:shd w:fill="F2F6FA"/>
+          </w:tcPr>
+          <w:p>
+            <w:r>
+              <w:rPr>
+                <w:rFonts w:ascii="Aptos" w:hAnsi="Aptos"/>
+                <w:sz w:val="18"/>
+              </w:rPr>
+              <w:t>Compare OpenWrt, Turris OS, and OPNsense for the existing home-cloud topology. Design segmentation, local DNS, traffic management, offline configuration, acceptance tests, and physical rollback without changing the current router.</w:t>
+            </w:r>
+          </w:p>
+        </w:tc>
+      </w:tr>
+    </w:tbl>
+    <w:p/>
+    <w:p>
+      <w:pPr>
+        <w:pStyle w:val="Heading2"/>
+      </w:pPr>
+      <w:r>
+        <w:t>Why this stage was needed</w:t>
+      </w:r>
+    </w:p>
+    <w:p>
+      <w:r>
+        <w:t>An open router improves control of VLANs, DNS, firewalling, and updates, but a one-step network replacement would create unnecessary outage risk.</w:t>
+      </w:r>
+    </w:p>
+    <w:p>
+      <w:pPr>
+        <w:pStyle w:val="Heading2"/>
+      </w:pPr>
+      <w:r>
+        <w:t>What was created</w:t>
+      </w:r>
+    </w:p>
+    <w:p>
+      <w:r>
+        <w:t>A documented recommendation and migration plan; no live router configuration has been applied yet.</w:t>
+      </w:r>
+    </w:p>
+    <w:p>
+      <w:pPr>
+        <w:pStyle w:val="Heading2"/>
+      </w:pPr>
+      <w:r>
+        <w:t>Execution result</w:t>
+      </w:r>
+    </w:p>
+    <w:p>
+      <w:r>
+        <w:rPr>
+          <w:b/>
+        </w:rPr>
+        <w:t>A supported OpenWrt appliance is the preferred ready-made direction, with budget and x86 firewall alternatives depending on requirements.</w:t>
+      </w:r>
+    </w:p>
+    <w:p>
+      <w:pPr>
+        <w:pStyle w:val="Heading2"/>
+      </w:pPr>
+      <w:r>
+        <w:t>How to verify it</w:t>
+      </w:r>
+    </w:p>
+    <w:p>
+      <w:pPr>
+        <w:pStyle w:val="ListBullet"/>
+      </w:pPr>
+      <w:r>
+        <w:t>Verify exact hardware revision against the current official support database, configure offline, test the existing LAN model, and switch only in a controlled window.</w:t>
+      </w:r>
+    </w:p>
+    <w:p>
+      <w:pPr>
+        <w:pStyle w:val="Heading2"/>
+      </w:pPr>
+      <w:r>
+        <w:t>Engineering lesson</w:t>
+      </w:r>
+    </w:p>
+    <w:p>
+      <w:r>
+        <w:t>A recommendation is not an implemented result and must be labeled accordingly.</w:t>
+      </w:r>
+    </w:p>
+    <w:p>
+      <w:pPr>
+        <w:pStyle w:val="Heading2"/>
+      </w:pPr>
+      <w:r>
+        <w:t>Completion criterion</w:t>
+      </w:r>
+    </w:p>
+    <w:p>
+      <w:r>
+        <w:t>The stage is complete only when the result is reproducible from the repository, verification passes without disclosing sensitive data, rollback is clear, and remaining risks are recorded.</w:t>
+      </w:r>
+    </w:p>
+    <w:p>
+      <w:r>
+        <w:br w:type="page"/>
+      </w:r>
+    </w:p>
+    <w:p>
+      <w:pPr>
+        <w:pStyle w:val="Heading1"/>
+      </w:pPr>
+      <w:r>
+        <w:t>Recommended next safe clarification</w:t>
+      </w:r>
+    </w:p>
+    <w:tbl>
+      <w:tblPr>
+        <w:tblW w:type="auto" w:w="0"/>
+        <w:jc w:val="center"/>
+        <w:tblLook w:firstColumn="1" w:firstRow="1" w:lastColumn="0" w:lastRow="0" w:noHBand="0" w:noVBand="1" w:val="04A0"/>
+      </w:tblPr>
+      <w:tblGrid>
+        <w:gridCol w:w="10080"/>
+      </w:tblGrid>
+      <w:tr>
+        <w:tc>
+          <w:tcPr>
+            <w:tcW w:type="dxa" w:w="10080"/>
+            <w:shd w:fill="F2F6FA"/>
+          </w:tcPr>
+          <w:p>
+            <w:r>
+              <w:rPr>
+                <w:rFonts w:ascii="Aptos" w:hAnsi="Aptos"/>
+                <w:sz w:val="18"/>
+              </w:rPr>
+              <w:t>Perform a separate read-only diagnosis of the failed storage-monitoring service on Jetson. Do not change USB, storage, mount configuration, Docker, firewall, VPN, or data. Collect only the service status, its own journal, installed configuration, hardware capability, and repository/runtime drift. Identify the root cause and propose a minimal fix, verification, and rollback, but do not apply the fix without separate approval.</w:t>
             </w:r>
           </w:p>
         </w:tc>

</xml_diff>